<commit_message>
docs: add comprehensive academic project report (DOCX, PDF) with embedded output screenshots and repository link
</commit_message>
<xml_diff>
--- a/Project_Report_Shader_Compiler_DSL.docx
+++ b/Project_Report_Shader_Compiler_DSL.docx
@@ -4,41 +4,36 @@
   <w:body>
     <w:p>
       <w:pPr>
+        <w:spacing w:before="240" w:after="80"/>
         <w:jc w:val="center"/>
       </w:pPr>
       <w:r>
         <w:rPr>
           <w:rFonts w:ascii="Arial" w:hAnsi="Arial"/>
           <w:b/>
-          <w:color w:val="0F3460"/>
-          <w:sz w:val="40"/>
+          <w:color w:val="0F172A"/>
+          <w:sz w:val="48"/>
         </w:rPr>
-        <w:t>PROJECT REPORT</w:t>
+        <w:t>SHADER PROGRAM COMPILER:</w:t>
         <w:br/>
-        <w:t>DOMAIN-SPECIFIC LANGUAGE (DSL) GRAPHICS COMPILER</w:t>
-        <w:br/>
-        <w:t>&amp; 2D/3D GAME ENGINE</w:t>
+        <w:t>2D/3D GRAPHICS &amp; GAME DSL ENGINE</w:t>
       </w:r>
     </w:p>
     <w:p>
       <w:pPr>
+        <w:spacing w:after="360"/>
         <w:jc w:val="center"/>
       </w:pPr>
       <w:r>
         <w:rPr>
-          <w:i/>
-          <w:color w:val="555555"/>
-          <w:sz w:val="24"/>
+          <w:rFonts w:ascii="Arial" w:hAnsi="Arial"/>
+          <w:color w:val="1E3A8A"/>
+          <w:sz w:val="26"/>
         </w:rPr>
-        <w:t>Comprehensive Technical Documentation, File Analysis &amp; University Review Guide</w:t>
+        <w:t>A High-Level Declarative Domain-Specific Language (DSL) &amp; C++ Source-to-Source Compiler</w:t>
         <w:br/>
-        <w:t>Semester 3 Coursework</w:t>
+        <w:t>Compiling to Native Hardware-Accelerated OpenGL 2.1 + SDL2 Desktop Binaries</w:t>
       </w:r>
-    </w:p>
-    <w:p>
-      <w:pPr>
-        <w:spacing w:after="160"/>
-      </w:pPr>
     </w:p>
     <w:tbl>
       <w:tblPr>
@@ -53,30 +48,39 @@
       <w:tr>
         <w:tc>
           <w:tcPr>
-            <w:tcW w:type="dxa" w:w="4680"/>
-            <w:shd w:val="clear" w:color="auto" w:fill="F0F4F8"/>
+            <w:tcW w:type="dxa" w:w="3168"/>
+            <w:shd w:fill="F8FAFC"/>
           </w:tcPr>
           <w:p>
+            <w:pPr>
+              <w:spacing w:before="60" w:after="60"/>
+            </w:pPr>
             <w:r>
               <w:rPr>
+                <w:rFonts w:ascii="Calibri" w:hAnsi="Calibri"/>
                 <w:b/>
+                <w:color w:val="0F172A"/>
                 <w:sz w:val="20"/>
               </w:rPr>
-              <w:t>Project Title:</w:t>
+              <w:t>Student Author</w:t>
             </w:r>
           </w:p>
         </w:tc>
         <w:tc>
           <w:tcPr>
-            <w:tcW w:type="dxa" w:w="4680"/>
-            <w:shd w:val="clear" w:color="auto" w:fill="FAFAFA"/>
+            <w:tcW w:type="dxa" w:w="6192"/>
           </w:tcPr>
           <w:p>
+            <w:pPr>
+              <w:spacing w:before="60" w:after="60"/>
+            </w:pPr>
             <w:r>
               <w:rPr>
+                <w:rFonts w:ascii="Calibri" w:hAnsi="Calibri"/>
+                <w:color w:val="1F2937"/>
                 <w:sz w:val="20"/>
               </w:rPr>
-              <w:t>Domain-Specific Language (DSL) Graphics Transpiler &amp; Engine</w:t>
+              <w:t>Eldho (Department of Computer Science &amp; Engineering)</w:t>
             </w:r>
           </w:p>
         </w:tc>
@@ -84,30 +88,39 @@
       <w:tr>
         <w:tc>
           <w:tcPr>
-            <w:tcW w:type="dxa" w:w="4680"/>
-            <w:shd w:val="clear" w:color="auto" w:fill="F0F4F8"/>
+            <w:tcW w:type="dxa" w:w="3168"/>
+            <w:shd w:fill="F8FAFC"/>
           </w:tcPr>
           <w:p>
+            <w:pPr>
+              <w:spacing w:before="60" w:after="60"/>
+            </w:pPr>
             <w:r>
               <w:rPr>
+                <w:rFonts w:ascii="Calibri" w:hAnsi="Calibri"/>
                 <w:b/>
+                <w:color w:val="0F172A"/>
                 <w:sz w:val="20"/>
               </w:rPr>
-              <w:t>Course / Term:</w:t>
+              <w:t>Course / Academic Level</w:t>
             </w:r>
           </w:p>
         </w:tc>
         <w:tc>
           <w:tcPr>
-            <w:tcW w:type="dxa" w:w="4680"/>
-            <w:shd w:val="clear" w:color="auto" w:fill="FAFAFA"/>
+            <w:tcW w:type="dxa" w:w="6192"/>
           </w:tcPr>
           <w:p>
+            <w:pPr>
+              <w:spacing w:before="60" w:after="60"/>
+            </w:pPr>
             <w:r>
               <w:rPr>
+                <w:rFonts w:ascii="Calibri" w:hAnsi="Calibri"/>
+                <w:color w:val="1F2937"/>
                 <w:sz w:val="20"/>
               </w:rPr>
-              <w:t>Semester 3 University Project (Review 1 &amp; Final Review)</w:t>
+              <w:t>Semester 3 Mini Project (Compiler Design &amp; Computer Graphics)</w:t>
             </w:r>
           </w:p>
         </w:tc>
@@ -115,30 +128,39 @@
       <w:tr>
         <w:tc>
           <w:tcPr>
-            <w:tcW w:type="dxa" w:w="4680"/>
-            <w:shd w:val="clear" w:color="auto" w:fill="F0F4F8"/>
+            <w:tcW w:type="dxa" w:w="3168"/>
+            <w:shd w:fill="F8FAFC"/>
           </w:tcPr>
           <w:p>
+            <w:pPr>
+              <w:spacing w:before="60" w:after="60"/>
+            </w:pPr>
             <w:r>
               <w:rPr>
+                <w:rFonts w:ascii="Calibri" w:hAnsi="Calibri"/>
                 <w:b/>
+                <w:color w:val="0F172A"/>
                 <w:sz w:val="20"/>
               </w:rPr>
-              <w:t>Team Members:</w:t>
+              <w:t>Core Technologies</w:t>
             </w:r>
           </w:p>
         </w:tc>
         <w:tc>
           <w:tcPr>
-            <w:tcW w:type="dxa" w:w="4680"/>
-            <w:shd w:val="clear" w:color="auto" w:fill="FAFAFA"/>
+            <w:tcW w:type="dxa" w:w="6192"/>
           </w:tcPr>
           <w:p>
+            <w:pPr>
+              <w:spacing w:before="60" w:after="60"/>
+            </w:pPr>
             <w:r>
               <w:rPr>
+                <w:rFonts w:ascii="Calibri" w:hAnsi="Calibri"/>
+                <w:color w:val="1F2937"/>
                 <w:sz w:val="20"/>
               </w:rPr>
-              <w:t>Eldho (24BAI0268), Hari (24BAI0262), Soujanya (24BCI0135), Pragadeeswar (24BCE0618)</w:t>
+              <w:t>C++17 Transpiler, ANSI C CodeGen, OpenGL 2.1, SDL2, GLSL Shaders</w:t>
             </w:r>
           </w:p>
         </w:tc>
@@ -146,61 +168,39 @@
       <w:tr>
         <w:tc>
           <w:tcPr>
-            <w:tcW w:type="dxa" w:w="4680"/>
-            <w:shd w:val="clear" w:color="auto" w:fill="F0F4F8"/>
+            <w:tcW w:type="dxa" w:w="3168"/>
+            <w:shd w:fill="F8FAFC"/>
           </w:tcPr>
           <w:p>
+            <w:pPr>
+              <w:spacing w:before="60" w:after="60"/>
+            </w:pPr>
             <w:r>
               <w:rPr>
+                <w:rFonts w:ascii="Calibri" w:hAnsi="Calibri"/>
                 <w:b/>
+                <w:color w:val="0F172A"/>
                 <w:sz w:val="20"/>
               </w:rPr>
-              <w:t>Core Technologies:</w:t>
+              <w:t>Official Repository</w:t>
             </w:r>
           </w:p>
         </w:tc>
         <w:tc>
           <w:tcPr>
-            <w:tcW w:type="dxa" w:w="4680"/>
-            <w:shd w:val="clear" w:color="auto" w:fill="FAFAFA"/>
+            <w:tcW w:type="dxa" w:w="6192"/>
           </w:tcPr>
           <w:p>
+            <w:pPr>
+              <w:spacing w:before="60" w:after="60"/>
+            </w:pPr>
             <w:r>
               <w:rPr>
+                <w:rFonts w:ascii="Calibri" w:hAnsi="Calibri"/>
+                <w:color w:val="1F2937"/>
                 <w:sz w:val="20"/>
               </w:rPr>
-              <w:t>C++17, C99, OpenGL 2.1 Compatibility Pipeline, GLSL 1.20, GLU, SDL2, GCC</w:t>
-            </w:r>
-          </w:p>
-        </w:tc>
-      </w:tr>
-      <w:tr>
-        <w:tc>
-          <w:tcPr>
-            <w:tcW w:type="dxa" w:w="4680"/>
-            <w:shd w:val="clear" w:color="auto" w:fill="F0F4F8"/>
-          </w:tcPr>
-          <w:p>
-            <w:r>
-              <w:rPr>
-                <w:b/>
-                <w:sz w:val="20"/>
-              </w:rPr>
-              <w:t>Repository Location:</w:t>
-            </w:r>
-          </w:p>
-        </w:tc>
-        <w:tc>
-          <w:tcPr>
-            <w:tcW w:type="dxa" w:w="4680"/>
-            <w:shd w:val="clear" w:color="auto" w:fill="FAFAFA"/>
-          </w:tcPr>
-          <w:p>
-            <w:r>
-              <w:rPr>
-                <w:sz w:val="20"/>
-              </w:rPr>
-              <w:t>/home/eldho/Eldho/SEM 3/uniporjects/shadercompailer/</w:t>
+              <w:t>https://github.com/eldhoGI2/shader-compiler (Public Access Verified)</w:t>
             </w:r>
           </w:p>
         </w:tc>
@@ -208,53 +208,1824 @@
     </w:tbl>
     <w:p>
       <w:pPr>
-        <w:spacing w:after="240"/>
+        <w:spacing w:before="240" w:after="240"/>
       </w:pPr>
     </w:p>
     <w:p>
       <w:pPr>
-        <w:pStyle w:val="Heading1"/>
-        <w:spacing w:before="320" w:after="120"/>
+        <w:keepNext/>
+        <w:spacing w:before="360" w:after="120"/>
       </w:pPr>
       <w:r>
         <w:rPr>
           <w:rFonts w:ascii="Arial" w:hAnsi="Arial"/>
           <w:b/>
-          <w:color w:val="0F3460"/>
-          <w:sz w:val="30"/>
+          <w:color w:val="1E3A8A"/>
+          <w:sz w:val="32"/>
         </w:rPr>
-        <w:t>1. Executive Summary &amp; Project Objectives</w:t>
-      </w:r>
-    </w:p>
-    <w:p>
-      <w:r>
-        <w:t>Modern computer graphics development in languages such as C and C++ requires managing extensive low-level boilerplate: window creation, pixel format configuration, memory allocation, OpenGL context lifecycle management, raw pointer handling, and matrix mathematics. For students and graphics designers, this steep learning curve obscures the creative process.</w:t>
-        <w:br/>
-        <w:br/>
-        <w:t>The primary goal of this project is to build an end-to-end Domain-Specific Language (DSL) and Source-to-Source Compiler (Transpiler) that enables users to author rich 2D vector art, compile hardware-accelerated GPU fragment shaders, play interactive 2D arcade games with collision physics, and navigate 3D first-person environments using clean, intuitive, English-like syntax.</w:t>
-        <w:br/>
-        <w:br/>
-        <w:t>The compiler takes custom '.my' scripts and translates them into standard, optimized C source code. This intermediate code links against our custom runtime library (graphics_runtime.h) and is compiled into a native desktop executable via the GCC toolchain with hardware acceleration provided by OpenGL 2.1 and SDL2.</w:t>
+        <w:t>1. Executive Summary &amp; Project Objectives (What We Have Done)</w:t>
       </w:r>
     </w:p>
     <w:p>
       <w:pPr>
-        <w:pStyle w:val="Heading1"/>
-        <w:spacing w:before="320" w:after="120"/>
+        <w:spacing w:after="120" w:line="276" w:lineRule="auto"/>
+      </w:pPr>
+      <w:r>
+        <w:rPr>
+          <w:rFonts w:ascii="Calibri" w:hAnsi="Calibri"/>
+          <w:b w:val="0"/>
+          <w:i w:val="0"/>
+          <w:color w:val="1F2937"/>
+          <w:sz w:val="22"/>
+        </w:rPr>
+        <w:t>Modern computer graphics programming in languages such as C and C++ requires managing extensive low-level boilerplate: window creation, pixel format configuration, memory allocation, OpenGL context lifecycle management, raw pointer handling, and matrix mathematics. For developers, students, and graphics designers, this steep learning curve obscures the creative process and introduces frequent state-machine bugs, context leaks, and segmentation faults.</w:t>
+      </w:r>
+    </w:p>
+    <w:p>
+      <w:pPr>
+        <w:spacing w:after="120" w:line="276" w:lineRule="auto"/>
+      </w:pPr>
+      <w:r>
+        <w:rPr>
+          <w:rFonts w:ascii="Calibri" w:hAnsi="Calibri"/>
+          <w:b w:val="0"/>
+          <w:i w:val="0"/>
+          <w:color w:val="1F2937"/>
+          <w:sz w:val="22"/>
+        </w:rPr>
+        <w:t>The primary goal of this project is to build an end-to-end Domain-Specific Language (DSL) and Source-to-Source Compiler (Transpiler) that enables users to author rich 2D vector art, compile hardware-accelerated GPU fragment shaders, play interactive 2D arcade games with collision physics, and navigate 3D first-person environments using clean, human-readable, declarative syntax.</w:t>
+      </w:r>
+    </w:p>
+    <w:p>
+      <w:pPr>
+        <w:spacing w:after="120" w:line="276" w:lineRule="auto"/>
+      </w:pPr>
+      <w:r>
+        <w:rPr>
+          <w:rFonts w:ascii="Calibri" w:hAnsi="Calibri"/>
+          <w:b w:val="0"/>
+          <w:i w:val="0"/>
+          <w:color w:val="1F2937"/>
+          <w:sz w:val="22"/>
+        </w:rPr>
+        <w:t>The compiler takes custom declarative '.my' scripts and translates them into standard, optimized intermediate C source code. This intermediate code links against our custom runtime library (graphics_runtime.h) and is compiled into a standalone desktop executable via the GCC toolchain with hardware acceleration provided by OpenGL 2.1 and SDL2.</w:t>
+      </w:r>
+    </w:p>
+    <w:p>
+      <w:pPr>
+        <w:keepNext/>
+        <w:spacing w:before="280" w:after="80"/>
       </w:pPr>
       <w:r>
         <w:rPr>
           <w:rFonts w:ascii="Arial" w:hAnsi="Arial"/>
           <w:b/>
-          <w:color w:val="0F3460"/>
-          <w:sz w:val="30"/>
+          <w:color w:val="0F172A"/>
+          <w:sz w:val="26"/>
         </w:rPr>
-        <w:t>2. End-to-End System Working &amp; Architecture</w:t>
+        <w:t>1.1 Core Accomplishments Across Project Milestones</w:t>
       </w:r>
     </w:p>
     <w:p>
+      <w:pPr>
+        <w:pStyle w:val="ListBullet"/>
+        <w:spacing w:after="80" w:line="276" w:lineRule="auto"/>
+      </w:pPr>
       <w:r>
-        <w:t>The compiler operates as a seamless 4-stage compilation pipeline from source script to native binary execution:</w:t>
+        <w:rPr>
+          <w:rFonts w:ascii="Calibri" w:hAnsi="Calibri"/>
+          <w:b/>
+          <w:color w:val="0F172A"/>
+          <w:sz w:val="22"/>
+        </w:rPr>
+        <w:t>Declarative Graphics DSL (.my):</w:t>
+      </w:r>
+      <w:r>
+        <w:rPr>
+          <w:rFonts w:ascii="Calibri" w:hAnsi="Calibri"/>
+          <w:color w:val="1F2937"/>
+          <w:sz w:val="22"/>
+        </w:rPr>
+        <w:t xml:space="preserve"> Designed a human-readable language syntax where single statements replace tens of lines of raw OpenGL boilerplate (e.g., 'window 800 600', 'bg #060614', 'shader grid', 'pong', 'mode_3d').</w:t>
+      </w:r>
+    </w:p>
+    <w:p>
+      <w:pPr>
+        <w:pStyle w:val="ListBullet"/>
+        <w:spacing w:after="80" w:line="276" w:lineRule="auto"/>
+      </w:pPr>
+      <w:r>
+        <w:rPr>
+          <w:rFonts w:ascii="Calibri" w:hAnsi="Calibri"/>
+          <w:b/>
+          <w:color w:val="0F172A"/>
+          <w:sz w:val="22"/>
+        </w:rPr>
+        <w:t>Automated Source-to-Source Compiler (Transpiler):</w:t>
+      </w:r>
+      <w:r>
+        <w:rPr>
+          <w:rFonts w:ascii="Calibri" w:hAnsi="Calibri"/>
+          <w:color w:val="1F2937"/>
+          <w:sz w:val="22"/>
+        </w:rPr>
+        <w:t xml:space="preserve"> Implemented a full compiler frontend in C++17 (Lexer, Parser, AST representation, and ANSI C code emission) that handles compilation and linking in a single automated step.</w:t>
+      </w:r>
+    </w:p>
+    <w:p>
+      <w:pPr>
+        <w:pStyle w:val="ListBullet"/>
+        <w:spacing w:after="80" w:line="276" w:lineRule="auto"/>
+      </w:pPr>
+      <w:r>
+        <w:rPr>
+          <w:rFonts w:ascii="Calibri" w:hAnsi="Calibri"/>
+          <w:b/>
+          <w:color w:val="0F172A"/>
+          <w:sz w:val="22"/>
+        </w:rPr>
+        <w:t>2D Primitive Vector Suite &amp; 35+ Colors:</w:t>
+      </w:r>
+      <w:r>
+        <w:rPr>
+          <w:rFonts w:ascii="Calibri" w:hAnsi="Calibri"/>
+          <w:color w:val="1F2937"/>
+          <w:sz w:val="22"/>
+        </w:rPr>
+        <w:t xml:space="preserve"> Engineered rasterization routines for rectangles, rounded rectangles, squares, centered boxes, circles, and ellipses, alongside a 35+ named color dictionary, hex color support, and linear gradients.</w:t>
+      </w:r>
+    </w:p>
+    <w:p>
+      <w:pPr>
+        <w:pStyle w:val="ListBullet"/>
+        <w:spacing w:after="80" w:line="276" w:lineRule="auto"/>
+      </w:pPr>
+      <w:r>
+        <w:rPr>
+          <w:rFonts w:ascii="Calibri" w:hAnsi="Calibri"/>
+          <w:b/>
+          <w:color w:val="0F172A"/>
+          <w:sz w:val="22"/>
+        </w:rPr>
+        <w:t>GPU GLSL Fragment Shader Pipeline:</w:t>
+      </w:r>
+      <w:r>
+        <w:rPr>
+          <w:rFonts w:ascii="Calibri" w:hAnsi="Calibri"/>
+          <w:color w:val="1F2937"/>
+          <w:sz w:val="22"/>
+        </w:rPr>
+        <w:t xml:space="preserve"> Built a shader compiler within the runtime that executes per-pixel GLSL shaders (plasma, cyberpunk grid, waves, CRT scanlines, starfield) with dynamic uniform streaming (u_time, u_resolution) and runtime hot-swapping via Spacebar.</w:t>
+      </w:r>
+    </w:p>
+    <w:p>
+      <w:pPr>
+        <w:pStyle w:val="ListBullet"/>
+        <w:spacing w:after="80" w:line="276" w:lineRule="auto"/>
+      </w:pPr>
+      <w:r>
+        <w:rPr>
+          <w:rFonts w:ascii="Calibri" w:hAnsi="Calibri"/>
+          <w:b/>
+          <w:color w:val="0F172A"/>
+          <w:sz w:val="22"/>
+        </w:rPr>
+        <w:t>Interactive 2D Pong Arcade Engine:</w:t>
+      </w:r>
+      <w:r>
+        <w:rPr>
+          <w:rFonts w:ascii="Calibri" w:hAnsi="Calibri"/>
+          <w:color w:val="1F2937"/>
+          <w:sz w:val="22"/>
+        </w:rPr>
+        <w:t xml:space="preserve"> Developed an interactive game engine with continuous keyboard polling, Circle vs. Axis-Aligned Bounding Box (AABB) collision mathematics, autonomous AI tracking paddle with reaction lag, and a live retro scoreboard.</w:t>
+      </w:r>
+    </w:p>
+    <w:p>
+      <w:pPr>
+        <w:pStyle w:val="ListBullet"/>
+        <w:spacing w:after="80" w:line="276" w:lineRule="auto"/>
+      </w:pPr>
+      <w:r>
+        <w:rPr>
+          <w:rFonts w:ascii="Calibri" w:hAnsi="Calibri"/>
+          <w:b/>
+          <w:color w:val="0F172A"/>
+          <w:sz w:val="22"/>
+        </w:rPr>
+        <w:t>Navigable 3D First-Person POV World Engine:</w:t>
+      </w:r>
+      <w:r>
+        <w:rPr>
+          <w:rFonts w:ascii="Calibri" w:hAnsi="Calibri"/>
+          <w:color w:val="1F2937"/>
+          <w:sz w:val="22"/>
+        </w:rPr>
+        <w:t xml:space="preserve"> Engineered a complete 3D environment with perspective projection, depth-buffering (GL_DEPTH_TEST), first-person WASD movement, mouse-look camera, procedural floor grids, perimeter walls, and axial wall-sliding collision physics.</w:t>
+      </w:r>
+    </w:p>
+    <w:p>
+      <w:pPr>
+        <w:keepNext/>
+        <w:spacing w:before="360" w:after="120"/>
+      </w:pPr>
+      <w:r>
+        <w:rPr>
+          <w:rFonts w:ascii="Arial" w:hAnsi="Arial"/>
+          <w:b/>
+          <w:color w:val="1E3A8A"/>
+          <w:sz w:val="32"/>
+        </w:rPr>
+        <w:t>2. Methodology &amp; System Architecture (How We Did It)</w:t>
+      </w:r>
+    </w:p>
+    <w:p>
+      <w:pPr>
+        <w:spacing w:after="120" w:line="276" w:lineRule="auto"/>
+      </w:pPr>
+      <w:r>
+        <w:rPr>
+          <w:rFonts w:ascii="Calibri" w:hAnsi="Calibri"/>
+          <w:b w:val="0"/>
+          <w:i w:val="0"/>
+          <w:color w:val="1F2937"/>
+          <w:sz w:val="22"/>
+        </w:rPr>
+        <w:t>The system operates as an automated 5-stage compilation pipeline from source script to native 60 FPS binary execution:</w:t>
+      </w:r>
+    </w:p>
+    <w:p>
+      <w:pPr>
+        <w:spacing w:before="200" w:after="80"/>
+        <w:jc w:val="center"/>
+      </w:pPr>
+      <w:r>
+        <w:drawing>
+          <wp:inline xmlns:a="http://schemas.openxmlformats.org/drawingml/2006/main" xmlns:pic="http://schemas.openxmlformats.org/drawingml/2006/picture">
+            <wp:extent cx="5669280" cy="1247242"/>
+            <wp:docPr id="1" name="Picture 1"/>
+            <wp:cNvGraphicFramePr>
+              <a:graphicFrameLocks noChangeAspect="1"/>
+            </wp:cNvGraphicFramePr>
+            <a:graphic>
+              <a:graphicData uri="http://schemas.openxmlformats.org/drawingml/2006/picture">
+                <pic:pic>
+                  <pic:nvPicPr>
+                    <pic:cNvPr id="0" name="pipeline_workflow_clean.png"/>
+                    <pic:cNvPicPr/>
+                  </pic:nvPicPr>
+                  <pic:blipFill>
+                    <a:blip r:embed="rId9"/>
+                    <a:stretch>
+                      <a:fillRect/>
+                    </a:stretch>
+                  </pic:blipFill>
+                  <pic:spPr>
+                    <a:xfrm>
+                      <a:off x="0" y="0"/>
+                      <a:ext cx="5669280" cy="1247242"/>
+                    </a:xfrm>
+                    <a:prstGeom prst="rect"/>
+                  </pic:spPr>
+                </pic:pic>
+              </a:graphicData>
+            </a:graphic>
+          </wp:inline>
+        </w:drawing>
+      </w:r>
+    </w:p>
+    <w:p>
+      <w:pPr>
+        <w:spacing w:after="240"/>
+        <w:jc w:val="center"/>
+      </w:pPr>
+      <w:r>
+        <w:rPr>
+          <w:rFonts w:ascii="Calibri" w:hAnsi="Calibri"/>
+          <w:i/>
+          <w:color w:val="4B5563"/>
+          <w:sz w:val="20"/>
+        </w:rPr>
+        <w:t>Figure 1: The End-to-End Compiler and Runtime Execution Pipeline Workflow</w:t>
+      </w:r>
+    </w:p>
+    <w:p>
+      <w:pPr>
+        <w:keepNext/>
+        <w:spacing w:before="280" w:after="80"/>
+      </w:pPr>
+      <w:r>
+        <w:rPr>
+          <w:rFonts w:ascii="Arial" w:hAnsi="Arial"/>
+          <w:b/>
+          <w:color w:val="0F172A"/>
+          <w:sz w:val="26"/>
+        </w:rPr>
+        <w:t>2.1 The 5-Stage Compilation Pipeline</w:t>
+      </w:r>
+    </w:p>
+    <w:p>
+      <w:pPr>
+        <w:pStyle w:val="ListBullet"/>
+        <w:spacing w:after="80" w:line="276" w:lineRule="auto"/>
+      </w:pPr>
+      <w:r>
+        <w:rPr>
+          <w:rFonts w:ascii="Calibri" w:hAnsi="Calibri"/>
+          <w:b/>
+          <w:color w:val="0F172A"/>
+          <w:sz w:val="22"/>
+        </w:rPr>
+        <w:t>Stage 1 — Source Script (.my):</w:t>
+      </w:r>
+      <w:r>
+        <w:rPr>
+          <w:rFonts w:ascii="Calibri" w:hAnsi="Calibri"/>
+          <w:color w:val="1F2937"/>
+          <w:sz w:val="22"/>
+        </w:rPr>
+        <w:t xml:space="preserve"> The programmer writes high-level declarative commands declaring canvas dimensions, shaders, 2D shapes, 3D structures, or game modes.</w:t>
+      </w:r>
+    </w:p>
+    <w:p>
+      <w:pPr>
+        <w:pStyle w:val="ListBullet"/>
+        <w:spacing w:after="80" w:line="276" w:lineRule="auto"/>
+      </w:pPr>
+      <w:r>
+        <w:rPr>
+          <w:rFonts w:ascii="Calibri" w:hAnsi="Calibri"/>
+          <w:b/>
+          <w:color w:val="0F172A"/>
+          <w:sz w:val="22"/>
+        </w:rPr>
+        <w:t>Stage 2 — Lexical Analysis &amp; Tokenization:</w:t>
+      </w:r>
+      <w:r>
+        <w:rPr>
+          <w:rFonts w:ascii="Calibri" w:hAnsi="Calibri"/>
+          <w:color w:val="1F2937"/>
+          <w:sz w:val="22"/>
+        </w:rPr>
+        <w:t xml:space="preserve"> The lexer in compiler.cpp scans the source text, strips comments (#), normalizes whitespace, and categorizes tokens (TOKEN_WINDOW, TOKEN_CUBE, TOKEN_PONG, etc.) while parsing named and hex colors into ColorRGB structs.</w:t>
+      </w:r>
+    </w:p>
+    <w:p>
+      <w:pPr>
+        <w:pStyle w:val="ListBullet"/>
+        <w:spacing w:after="80" w:line="276" w:lineRule="auto"/>
+      </w:pPr>
+      <w:r>
+        <w:rPr>
+          <w:rFonts w:ascii="Calibri" w:hAnsi="Calibri"/>
+          <w:b/>
+          <w:color w:val="0F172A"/>
+          <w:sz w:val="22"/>
+        </w:rPr>
+        <w:t>Stage 3 — Syntactic Analysis &amp; AST Validation:</w:t>
+      </w:r>
+      <w:r>
+        <w:rPr>
+          <w:rFonts w:ascii="Calibri" w:hAnsi="Calibri"/>
+          <w:color w:val="1F2937"/>
+          <w:sz w:val="22"/>
+        </w:rPr>
+        <w:t xml:space="preserve"> The parser validates token sequences and argument counts, building an internal Abstract Syntax Tree (AST) representing statements in the script.</w:t>
+      </w:r>
+    </w:p>
+    <w:p>
+      <w:pPr>
+        <w:pStyle w:val="ListBullet"/>
+        <w:spacing w:after="80" w:line="276" w:lineRule="auto"/>
+      </w:pPr>
+      <w:r>
+        <w:rPr>
+          <w:rFonts w:ascii="Calibri" w:hAnsi="Calibri"/>
+          <w:b/>
+          <w:color w:val="0F172A"/>
+          <w:sz w:val="22"/>
+        </w:rPr>
+        <w:t>Stage 4 — Intermediate ANSI C Code Generation:</w:t>
+      </w:r>
+      <w:r>
+        <w:rPr>
+          <w:rFonts w:ascii="Calibri" w:hAnsi="Calibri"/>
+          <w:color w:val="1F2937"/>
+          <w:sz w:val="22"/>
+        </w:rPr>
+        <w:t xml:space="preserve"> The transpiler traverses the AST and emits structured, highly readable C code into generated_game.c. Static geometry is wrapped inside pre-compiled OpenGL Display Lists (glNewList) for zero-overhead rendering.</w:t>
+      </w:r>
+    </w:p>
+    <w:p>
+      <w:pPr>
+        <w:pStyle w:val="ListBullet"/>
+        <w:spacing w:after="80" w:line="276" w:lineRule="auto"/>
+      </w:pPr>
+      <w:r>
+        <w:rPr>
+          <w:rFonts w:ascii="Calibri" w:hAnsi="Calibri"/>
+          <w:b/>
+          <w:color w:val="0F172A"/>
+          <w:sz w:val="22"/>
+        </w:rPr>
+        <w:t>Stage 5 — Automated GCC Compilation &amp; Link:</w:t>
+      </w:r>
+      <w:r>
+        <w:rPr>
+          <w:rFonts w:ascii="Calibri" w:hAnsi="Calibri"/>
+          <w:color w:val="1F2937"/>
+          <w:sz w:val="22"/>
+        </w:rPr>
+        <w:t xml:space="preserve"> The compiler automatically invokes the GCC toolchain via system(): 'gcc generated_game.c -lSDL2 -lGL -lGLU -lm -o final_game', creating a standalone native executable with full GPU acceleration.</w:t>
+      </w:r>
+    </w:p>
+    <w:p>
+      <w:pPr>
+        <w:keepNext/>
+        <w:spacing w:before="280" w:after="80"/>
+      </w:pPr>
+      <w:r>
+        <w:rPr>
+          <w:rFonts w:ascii="Arial" w:hAnsi="Arial"/>
+          <w:b/>
+          <w:color w:val="0F172A"/>
+          <w:sz w:val="26"/>
+        </w:rPr>
+        <w:t>2.2 Dual-Pipeline Runtime Architecture</w:t>
+      </w:r>
+    </w:p>
+    <w:p>
+      <w:pPr>
+        <w:spacing w:after="120" w:line="276" w:lineRule="auto"/>
+      </w:pPr>
+      <w:r>
+        <w:rPr>
+          <w:rFonts w:ascii="Calibri" w:hAnsi="Calibri"/>
+          <w:b w:val="0"/>
+          <w:i w:val="0"/>
+          <w:color w:val="1F2937"/>
+          <w:sz w:val="22"/>
+        </w:rPr>
+        <w:t>The runtime engine (graphics_runtime.h) combines the best of both fixed-function and programmable OpenGL 2.1 pipelines:</w:t>
+      </w:r>
+    </w:p>
+    <w:p>
+      <w:pPr>
+        <w:pStyle w:val="ListBullet"/>
+        <w:spacing w:after="80" w:line="276" w:lineRule="auto"/>
+      </w:pPr>
+      <w:r>
+        <w:rPr>
+          <w:rFonts w:ascii="Calibri" w:hAnsi="Calibri"/>
+          <w:b/>
+          <w:color w:val="0F172A"/>
+          <w:sz w:val="22"/>
+        </w:rPr>
+        <w:t>Display List Pre-compilation:</w:t>
+      </w:r>
+      <w:r>
+        <w:rPr>
+          <w:rFonts w:ascii="Calibri" w:hAnsi="Calibri"/>
+          <w:color w:val="1F2937"/>
+          <w:sz w:val="22"/>
+        </w:rPr>
+        <w:t xml:space="preserve"> Static geometry specified in the DSL script is recorded into GPU display lists (glGenLists) at initialization time. During frame rendering, the entire scene is redrawn using a single glCallList() command, avoiding CPU-to-GPU vertex transfer bottlenecks.</w:t>
+      </w:r>
+    </w:p>
+    <w:p>
+      <w:pPr>
+        <w:pStyle w:val="ListBullet"/>
+        <w:spacing w:after="80" w:line="276" w:lineRule="auto"/>
+      </w:pPr>
+      <w:r>
+        <w:rPr>
+          <w:rFonts w:ascii="Calibri" w:hAnsi="Calibri"/>
+          <w:b/>
+          <w:color w:val="0F172A"/>
+          <w:sz w:val="22"/>
+        </w:rPr>
+        <w:t>Programmable GPU Fragment Shaders:</w:t>
+      </w:r>
+      <w:r>
+        <w:rPr>
+          <w:rFonts w:ascii="Calibri" w:hAnsi="Calibri"/>
+          <w:color w:val="1F2937"/>
+          <w:sz w:val="22"/>
+        </w:rPr>
+        <w:t xml:space="preserve"> A full-screen textured quad is drawn behind the scene with active GLSL fragment shaders. The runtime updates u_time and u_resolution uniforms every frame, enabling animated background shaders at 60 FPS.</w:t>
+      </w:r>
+    </w:p>
+    <w:p>
+      <w:pPr>
+        <w:keepNext/>
+        <w:spacing w:before="280" w:after="80"/>
+      </w:pPr>
+      <w:r>
+        <w:rPr>
+          <w:rFonts w:ascii="Arial" w:hAnsi="Arial"/>
+          <w:b/>
+          <w:color w:val="0F172A"/>
+          <w:sz w:val="26"/>
+        </w:rPr>
+        <w:t>2.3 Collision Mathematics &amp; Physics Formulations</w:t>
+      </w:r>
+    </w:p>
+    <w:p>
+      <w:pPr>
+        <w:spacing w:after="120" w:line="276" w:lineRule="auto"/>
+      </w:pPr>
+      <w:r>
+        <w:rPr>
+          <w:rFonts w:ascii="Calibri" w:hAnsi="Calibri"/>
+          <w:b w:val="0"/>
+          <w:i w:val="0"/>
+          <w:color w:val="1F2937"/>
+          <w:sz w:val="22"/>
+        </w:rPr>
+        <w:t>Real-time physics are implemented directly within the runtime engine without relying on heavy external physics libraries:</w:t>
+      </w:r>
+    </w:p>
+    <w:p>
+      <w:pPr>
+        <w:keepNext/>
+        <w:spacing w:before="200" w:after="60"/>
+      </w:pPr>
+      <w:r>
+        <w:rPr>
+          <w:rFonts w:ascii="Calibri" w:hAnsi="Calibri"/>
+          <w:b/>
+          <w:color w:val="1F2937"/>
+          <w:sz w:val="23"/>
+        </w:rPr>
+        <w:t>A. 2D Pong: Circle vs. Axis-Aligned Bounding Box (AABB) Collision</w:t>
+      </w:r>
+    </w:p>
+    <w:p>
+      <w:pPr>
+        <w:spacing w:after="120" w:line="276" w:lineRule="auto"/>
+      </w:pPr>
+      <w:r>
+        <w:rPr>
+          <w:rFonts w:ascii="Calibri" w:hAnsi="Calibri"/>
+          <w:b w:val="0"/>
+          <w:i w:val="0"/>
+          <w:color w:val="1F2937"/>
+          <w:sz w:val="22"/>
+        </w:rPr>
+        <w:t>For a ball with center (bx, by) and radius r, and a paddle with center (px, py), width w, and height h, collision occurs if and only if:</w:t>
+      </w:r>
+    </w:p>
+    <w:tbl>
+      <w:tblPr>
+        <w:tblW w:type="auto" w:w="0"/>
+        <w:jc w:val="center"/>
+        <w:tblLook w:firstColumn="1" w:firstRow="1" w:lastColumn="0" w:lastRow="0" w:noHBand="0" w:noVBand="1" w:val="04A0"/>
+      </w:tblPr>
+      <w:tblGrid>
+        <w:gridCol w:w="9360"/>
+      </w:tblGrid>
+      <w:tr>
+        <w:tc>
+          <w:tcPr>
+            <w:tcW w:type="dxa" w:w="9360"/>
+            <w:shd w:fill="F1F5F9"/>
+            <w:tcBorders>
+              <w:top w:val="none"/>
+              <w:left w:val="single" w:sz="18" w:space="0" w:color="0F172A"/>
+              <w:bottom w:val="none"/>
+              <w:right w:val="none"/>
+            </w:tcBorders>
+          </w:tcPr>
+          <w:p>
+            <w:pPr>
+              <w:spacing w:before="80" w:after="80" w:line="252" w:lineRule="auto"/>
+            </w:pPr>
+            <w:r>
+              <w:rPr>
+                <w:rFonts w:ascii="Consolas" w:hAnsi="Consolas"/>
+                <w:color w:val="0F172A"/>
+                <w:sz w:val="19"/>
+              </w:rPr>
+              <w:t>|bx - px| &lt;= (w / 2) + r   AND   |by - py| &lt;= (h / 2) + r</w:t>
+            </w:r>
+          </w:p>
+        </w:tc>
+      </w:tr>
+    </w:tbl>
+    <w:p>
+      <w:pPr>
+        <w:spacing w:after="80"/>
+      </w:pPr>
+    </w:p>
+    <w:p>
+      <w:pPr>
+        <w:spacing w:after="120" w:line="276" w:lineRule="auto"/>
+      </w:pPr>
+      <w:r>
+        <w:rPr>
+          <w:rFonts w:ascii="Calibri" w:hAnsi="Calibri"/>
+          <w:b w:val="0"/>
+          <w:i w:val="0"/>
+          <w:color w:val="1F2937"/>
+          <w:sz w:val="22"/>
+        </w:rPr>
+        <w:t>When collision is confirmed, the horizontal velocity is inverted (vx = -vx), and the vertical velocity (vy) is dynamically adjusted based on the distance from the paddle's center: vy = 5.0 * ((by - py) / (h / 2)). This allows skilled players to aim their shots.</w:t>
+      </w:r>
+    </w:p>
+    <w:p>
+      <w:pPr>
+        <w:keepNext/>
+        <w:spacing w:before="200" w:after="60"/>
+      </w:pPr>
+      <w:r>
+        <w:rPr>
+          <w:rFonts w:ascii="Calibri" w:hAnsi="Calibri"/>
+          <w:b/>
+          <w:color w:val="1F2937"/>
+          <w:sz w:val="23"/>
+        </w:rPr>
+        <w:t>B. 3D First-Person Wall-Sliding Collision</w:t>
+      </w:r>
+    </w:p>
+    <w:p>
+      <w:pPr>
+        <w:spacing w:after="120" w:line="276" w:lineRule="auto"/>
+      </w:pPr>
+      <w:r>
+        <w:rPr>
+          <w:rFonts w:ascii="Calibri" w:hAnsi="Calibri"/>
+          <w:b w:val="0"/>
+          <w:i w:val="0"/>
+          <w:color w:val="1F2937"/>
+          <w:sz w:val="22"/>
+        </w:rPr>
+        <w:t>In the 3D first-person environment, candidate positions (nx, nz) are calculated from player velocity and camera yaw. The engine checks X and Z axes independently against bounding boxes of walls, cubes, and monolith pillars. If movement along the X axis causes an intersection, nx is clamped to the obstacle surface while nz is allowed to proceed. This produces smooth, natural wall-sliding collision rather than rigid sticking.</w:t>
+      </w:r>
+    </w:p>
+    <w:p>
+      <w:pPr>
+        <w:keepNext/>
+        <w:spacing w:before="360" w:after="120"/>
+      </w:pPr>
+      <w:r>
+        <w:rPr>
+          <w:rFonts w:ascii="Arial" w:hAnsi="Arial"/>
+          <w:b/>
+          <w:color w:val="1E3A8A"/>
+          <w:sz w:val="32"/>
+        </w:rPr>
+        <w:t>3. Major Files &amp; Code Implementation Breakdown</w:t>
+      </w:r>
+    </w:p>
+    <w:p>
+      <w:pPr>
+        <w:spacing w:after="120" w:line="276" w:lineRule="auto"/>
+      </w:pPr>
+      <w:r>
+        <w:rPr>
+          <w:rFonts w:ascii="Calibri" w:hAnsi="Calibri"/>
+          <w:b w:val="0"/>
+          <w:i w:val="0"/>
+          <w:color w:val="1F2937"/>
+          <w:sz w:val="22"/>
+        </w:rPr>
+        <w:t>The codebase is structured into four functional groups: the compiler frontend, the runtime backend engine, the DSL application scripts, and the build outputs.</w:t>
+      </w:r>
+    </w:p>
+    <w:p>
+      <w:pPr>
+        <w:keepNext/>
+        <w:spacing w:before="280" w:after="80"/>
+      </w:pPr>
+      <w:r>
+        <w:rPr>
+          <w:rFonts w:ascii="Arial" w:hAnsi="Arial"/>
+          <w:b/>
+          <w:color w:val="0F172A"/>
+          <w:sz w:val="26"/>
+        </w:rPr>
+        <w:t>3.1 Compiler Frontend: compiler.cpp</w:t>
+      </w:r>
+    </w:p>
+    <w:p>
+      <w:pPr>
+        <w:spacing w:after="120" w:line="276" w:lineRule="auto"/>
+      </w:pPr>
+      <w:r>
+        <w:rPr>
+          <w:rFonts w:ascii="Calibri" w:hAnsi="Calibri"/>
+          <w:b w:val="0"/>
+          <w:i w:val="0"/>
+          <w:color w:val="1F2937"/>
+          <w:sz w:val="22"/>
+        </w:rPr>
+        <w:t>Written in C++17, compiler.cpp contains the entire language scanner, token dictionary, AST hierarchy, and C code generator.</w:t>
+      </w:r>
+    </w:p>
+    <w:p>
+      <w:pPr>
+        <w:pStyle w:val="ListBullet"/>
+        <w:spacing w:after="80" w:line="276" w:lineRule="auto"/>
+      </w:pPr>
+      <w:r>
+        <w:rPr>
+          <w:rFonts w:ascii="Calibri" w:hAnsi="Calibri"/>
+          <w:b/>
+          <w:color w:val="0F172A"/>
+          <w:sz w:val="22"/>
+        </w:rPr>
+        <w:t>Token Enumeration (TokenType):</w:t>
+      </w:r>
+      <w:r>
+        <w:rPr>
+          <w:rFonts w:ascii="Calibri" w:hAnsi="Calibri"/>
+          <w:color w:val="1F2937"/>
+          <w:sz w:val="22"/>
+        </w:rPr>
+        <w:t xml:space="preserve"> Defines 50+ tokens including TOKEN_WINDOW, TOKEN_TITLE, TOKEN_BG, TOKEN_SHADER, TOKEN_CUSTOM_SHADER, TOKEN_PONG, TOKEN_PADDLE, TOKEN_AI_PADDLE, TOKEN_BALL, TOKEN_3D, TOKEN_FLOOR, TOKEN_WALLS, TOKEN_CUBE, TOKEN_PILLAR, TOKEN_ROTATE, TOKEN_TRANSLATE, TOKEN_SCALE, TOKEN_RECTANGLE, TOKEN_CIRCLE.</w:t>
+      </w:r>
+    </w:p>
+    <w:p>
+      <w:pPr>
+        <w:pStyle w:val="ListBullet"/>
+        <w:spacing w:after="80" w:line="276" w:lineRule="auto"/>
+      </w:pPr>
+      <w:r>
+        <w:rPr>
+          <w:rFonts w:ascii="Calibri" w:hAnsi="Calibri"/>
+          <w:b/>
+          <w:color w:val="0F172A"/>
+          <w:sz w:val="22"/>
+        </w:rPr>
+        <w:t>Smart Color Tokenizer (parse_color_token):</w:t>
+      </w:r>
+      <w:r>
+        <w:rPr>
+          <w:rFonts w:ascii="Calibri" w:hAnsi="Calibri"/>
+          <w:color w:val="1F2937"/>
+          <w:sz w:val="22"/>
+        </w:rPr>
+        <w:t xml:space="preserve"> Resolves named English colors (e.g., 'gold', 'cyan', 'lime', 'crimson', 'coral') and web hex strings ('#060614', '#00d2ff') into standard ColorRGB numerical triplets.</w:t>
+      </w:r>
+    </w:p>
+    <w:p>
+      <w:pPr>
+        <w:pStyle w:val="ListBullet"/>
+        <w:spacing w:after="80" w:line="276" w:lineRule="auto"/>
+      </w:pPr>
+      <w:r>
+        <w:rPr>
+          <w:rFonts w:ascii="Calibri" w:hAnsi="Calibri"/>
+          <w:b/>
+          <w:color w:val="0F172A"/>
+          <w:sz w:val="22"/>
+        </w:rPr>
+        <w:t>AST to C Transpilation Loop:</w:t>
+      </w:r>
+      <w:r>
+        <w:rPr>
+          <w:rFonts w:ascii="Calibri" w:hAnsi="Calibri"/>
+          <w:color w:val="1F2937"/>
+          <w:sz w:val="22"/>
+        </w:rPr>
+        <w:t xml:space="preserve"> Iterates over parsed tokens and outputs C runtime calls. For example, when encountering TOKEN_CUBE, it extracts x, y, z, size, and color parameters and emits:</w:t>
+      </w:r>
+    </w:p>
+    <w:tbl>
+      <w:tblPr>
+        <w:tblW w:type="auto" w:w="0"/>
+        <w:jc w:val="center"/>
+        <w:tblLook w:firstColumn="1" w:firstRow="1" w:lastColumn="0" w:lastRow="0" w:noHBand="0" w:noVBand="1" w:val="04A0"/>
+      </w:tblPr>
+      <w:tblGrid>
+        <w:gridCol w:w="9360"/>
+      </w:tblGrid>
+      <w:tr>
+        <w:tc>
+          <w:tcPr>
+            <w:tcW w:type="dxa" w:w="9360"/>
+            <w:shd w:fill="F1F5F9"/>
+            <w:tcBorders>
+              <w:top w:val="none"/>
+              <w:left w:val="single" w:sz="18" w:space="0" w:color="0F172A"/>
+              <w:bottom w:val="none"/>
+              <w:right w:val="none"/>
+            </w:tcBorders>
+          </w:tcPr>
+          <w:p>
+            <w:pPr>
+              <w:spacing w:before="80" w:after="80" w:line="252" w:lineRule="auto"/>
+            </w:pPr>
+            <w:r>
+              <w:rPr>
+                <w:rFonts w:ascii="Consolas" w:hAnsi="Consolas"/>
+                <w:color w:val="0F172A"/>
+                <w:sz w:val="19"/>
+              </w:rPr>
+              <w:t>// compiler.cpp — AST to C Code Generation for 3D Cubes</w:t>
+              <w:br/>
+              <w:t>else if (t == TOKEN_CUBE) {</w:t>
+              <w:br/>
+              <w:t xml:space="preserve">    string x = tokens[i+1].value;</w:t>
+              <w:br/>
+              <w:t xml:space="preserve">    string y = tokens[i+2].value;</w:t>
+              <w:br/>
+              <w:t xml:space="preserve">    string z = tokens[i+3].value;</w:t>
+              <w:br/>
+              <w:t xml:space="preserve">    string size = tokens[i+4].value;</w:t>
+              <w:br/>
+              <w:t xml:space="preserve">    size_t next_idx = i + 5;</w:t>
+              <w:br/>
+              <w:t xml:space="preserve">    ColorRGB c = parse_color_token(tokens, next_idx);</w:t>
+              <w:br/>
+              <w:t xml:space="preserve">    out_file &lt;&lt; "    add_3d_cube(" &lt;&lt; x &lt;&lt; ", " &lt;&lt; y &lt;&lt; ", " &lt;&lt; z </w:t>
+              <w:br/>
+              <w:t xml:space="preserve">             &lt;&lt; ", " &lt;&lt; size &lt;&lt; ", "</w:t>
+              <w:br/>
+              <w:t xml:space="preserve">             &lt;&lt; c.r &lt;&lt; ", " &lt;&lt; c.g &lt;&lt; ", " &lt;&lt; c.b &lt;&lt; ");" &lt;&lt; endl;</w:t>
+              <w:br/>
+              <w:t xml:space="preserve">    i = next_idx - 1;</w:t>
+              <w:br/>
+              <w:t>}</w:t>
+            </w:r>
+          </w:p>
+        </w:tc>
+      </w:tr>
+    </w:tbl>
+    <w:p>
+      <w:pPr>
+        <w:spacing w:after="80"/>
+      </w:pPr>
+    </w:p>
+    <w:p>
+      <w:pPr>
+        <w:pStyle w:val="ListBullet"/>
+        <w:spacing w:after="80" w:line="276" w:lineRule="auto"/>
+      </w:pPr>
+      <w:r>
+        <w:rPr>
+          <w:rFonts w:ascii="Calibri" w:hAnsi="Calibri"/>
+          <w:b/>
+          <w:color w:val="0F172A"/>
+          <w:sz w:val="22"/>
+        </w:rPr>
+        <w:t>Automated GCC Invocator:</w:t>
+      </w:r>
+      <w:r>
+        <w:rPr>
+          <w:rFonts w:ascii="Calibri" w:hAnsi="Calibri"/>
+          <w:color w:val="1F2937"/>
+          <w:sz w:val="22"/>
+        </w:rPr>
+        <w:t xml:space="preserve"> Upon writing generated_game.c, the main() function executes:</w:t>
+      </w:r>
+    </w:p>
+    <w:tbl>
+      <w:tblPr>
+        <w:tblW w:type="auto" w:w="0"/>
+        <w:jc w:val="center"/>
+        <w:tblLook w:firstColumn="1" w:firstRow="1" w:lastColumn="0" w:lastRow="0" w:noHBand="0" w:noVBand="1" w:val="04A0"/>
+      </w:tblPr>
+      <w:tblGrid>
+        <w:gridCol w:w="9360"/>
+      </w:tblGrid>
+      <w:tr>
+        <w:tc>
+          <w:tcPr>
+            <w:tcW w:type="dxa" w:w="9360"/>
+            <w:shd w:fill="F1F5F9"/>
+            <w:tcBorders>
+              <w:top w:val="none"/>
+              <w:left w:val="single" w:sz="18" w:space="0" w:color="0F172A"/>
+              <w:bottom w:val="none"/>
+              <w:right w:val="none"/>
+            </w:tcBorders>
+          </w:tcPr>
+          <w:p>
+            <w:pPr>
+              <w:spacing w:before="80" w:after="80" w:line="252" w:lineRule="auto"/>
+            </w:pPr>
+            <w:r>
+              <w:rPr>
+                <w:rFonts w:ascii="Consolas" w:hAnsi="Consolas"/>
+                <w:color w:val="0F172A"/>
+                <w:sz w:val="19"/>
+              </w:rPr>
+              <w:t>string cmd = "gcc generated_game.c -lSDL2 -lGL -lGLU -lm -o final_game";</w:t>
+              <w:br/>
+              <w:t>int res = system(cmd.c_str());</w:t>
+            </w:r>
+          </w:p>
+        </w:tc>
+      </w:tr>
+    </w:tbl>
+    <w:p>
+      <w:pPr>
+        <w:spacing w:after="80"/>
+      </w:pPr>
+    </w:p>
+    <w:p>
+      <w:pPr>
+        <w:keepNext/>
+        <w:spacing w:before="280" w:after="80"/>
+      </w:pPr>
+      <w:r>
+        <w:rPr>
+          <w:rFonts w:ascii="Arial" w:hAnsi="Arial"/>
+          <w:b/>
+          <w:color w:val="0F172A"/>
+          <w:sz w:val="26"/>
+        </w:rPr>
+        <w:t>3.2 Runtime Backend Engine: graphics_runtime.h</w:t>
+      </w:r>
+    </w:p>
+    <w:p>
+      <w:pPr>
+        <w:spacing w:after="120" w:line="276" w:lineRule="auto"/>
+      </w:pPr>
+      <w:r>
+        <w:rPr>
+          <w:rFonts w:ascii="Calibri" w:hAnsi="Calibri"/>
+          <w:b w:val="0"/>
+          <w:i w:val="0"/>
+          <w:color w:val="1F2937"/>
+          <w:sz w:val="22"/>
+        </w:rPr>
+        <w:t>An optimized, header-only C engine of over 1,500 lines providing the entire OpenGL 2.1 + SDL2 graphics and game execution layer.</w:t>
+      </w:r>
+    </w:p>
+    <w:p>
+      <w:pPr>
+        <w:pStyle w:val="ListBullet"/>
+        <w:spacing w:after="80" w:line="276" w:lineRule="auto"/>
+      </w:pPr>
+      <w:r>
+        <w:rPr>
+          <w:rFonts w:ascii="Calibri" w:hAnsi="Calibri"/>
+          <w:b/>
+          <w:color w:val="0F172A"/>
+          <w:sz w:val="22"/>
+        </w:rPr>
+        <w:t>Hardware Context Setup:</w:t>
+      </w:r>
+      <w:r>
+        <w:rPr>
+          <w:rFonts w:ascii="Calibri" w:hAnsi="Calibri"/>
+          <w:color w:val="1F2937"/>
+          <w:sz w:val="22"/>
+        </w:rPr>
+        <w:t xml:space="preserve"> Initializes SDL_Init(SDL_INIT_VIDEO), sets OpenGL 2.1 context attributes (SDL_GL_CONTEXT_MAJOR_VERSION = 2, MINOR = 1), configures 24-bit depth buffers, and creates double-buffered windows.</w:t>
+      </w:r>
+    </w:p>
+    <w:p>
+      <w:pPr>
+        <w:pStyle w:val="ListBullet"/>
+        <w:spacing w:after="80" w:line="276" w:lineRule="auto"/>
+      </w:pPr>
+      <w:r>
+        <w:rPr>
+          <w:rFonts w:ascii="Calibri" w:hAnsi="Calibri"/>
+          <w:b/>
+          <w:color w:val="0F172A"/>
+          <w:sz w:val="22"/>
+        </w:rPr>
+        <w:t>GLSL Shader Manager:</w:t>
+      </w:r>
+      <w:r>
+        <w:rPr>
+          <w:rFonts w:ascii="Calibri" w:hAnsi="Calibri"/>
+          <w:color w:val="1F2937"/>
+          <w:sz w:val="22"/>
+        </w:rPr>
+        <w:t xml:space="preserve"> Contains compile_shader_source() which compiles vertex and fragment shaders on the GPU driver and binds dynamic uniform locations:</w:t>
+      </w:r>
+    </w:p>
+    <w:tbl>
+      <w:tblPr>
+        <w:tblW w:type="auto" w:w="0"/>
+        <w:jc w:val="center"/>
+        <w:tblLook w:firstColumn="1" w:firstRow="1" w:lastColumn="0" w:lastRow="0" w:noHBand="0" w:noVBand="1" w:val="04A0"/>
+      </w:tblPr>
+      <w:tblGrid>
+        <w:gridCol w:w="9360"/>
+      </w:tblGrid>
+      <w:tr>
+        <w:tc>
+          <w:tcPr>
+            <w:tcW w:type="dxa" w:w="9360"/>
+            <w:shd w:fill="F1F5F9"/>
+            <w:tcBorders>
+              <w:top w:val="none"/>
+              <w:left w:val="single" w:sz="18" w:space="0" w:color="0F172A"/>
+              <w:bottom w:val="none"/>
+              <w:right w:val="none"/>
+            </w:tcBorders>
+          </w:tcPr>
+          <w:p>
+            <w:pPr>
+              <w:spacing w:before="80" w:after="80" w:line="252" w:lineRule="auto"/>
+            </w:pPr>
+            <w:r>
+              <w:rPr>
+                <w:rFonts w:ascii="Consolas" w:hAnsi="Consolas"/>
+                <w:color w:val="0F172A"/>
+                <w:sz w:val="19"/>
+              </w:rPr>
+              <w:t>// graphics_runtime.h — Dynamic Uniform Passing at 60 FPS</w:t>
+              <w:br/>
+              <w:t>if (has_shader &amp;&amp; active_shader_prog != 0) {</w:t>
+              <w:br/>
+              <w:t xml:space="preserve">    glUseProgram(active_shader_prog);</w:t>
+              <w:br/>
+              <w:t xml:space="preserve">    GLint loc_time = glGetUniformLocation(active_shader_prog, "u_time");</w:t>
+              <w:br/>
+              <w:t xml:space="preserve">    GLint loc_res = glGetUniformLocation(active_shader_prog, "u_resolution");</w:t>
+              <w:br/>
+              <w:t xml:space="preserve">    if (loc_time != -1) {</w:t>
+              <w:br/>
+              <w:t xml:space="preserve">        float current_time = (float)SDL_GetTicks() / 1000.0f;</w:t>
+              <w:br/>
+              <w:t xml:space="preserve">        glUniform1f(loc_time, current_time);</w:t>
+              <w:br/>
+              <w:t xml:space="preserve">    }</w:t>
+              <w:br/>
+              <w:t xml:space="preserve">    if (loc_res != -1) {</w:t>
+              <w:br/>
+              <w:t xml:space="preserve">        glUniform2f(loc_res, (float)screen_width, (float)screen_height);</w:t>
+              <w:br/>
+              <w:t xml:space="preserve">    }</w:t>
+              <w:br/>
+              <w:t xml:space="preserve">    // Render full-screen background quad...</w:t>
+              <w:br/>
+              <w:t>}</w:t>
+            </w:r>
+          </w:p>
+        </w:tc>
+      </w:tr>
+    </w:tbl>
+    <w:p>
+      <w:pPr>
+        <w:spacing w:after="80"/>
+      </w:pPr>
+    </w:p>
+    <w:p>
+      <w:pPr>
+        <w:pStyle w:val="ListBullet"/>
+        <w:spacing w:after="80" w:line="276" w:lineRule="auto"/>
+      </w:pPr>
+      <w:r>
+        <w:rPr>
+          <w:rFonts w:ascii="Calibri" w:hAnsi="Calibri"/>
+          <w:b/>
+          <w:color w:val="0F172A"/>
+          <w:sz w:val="22"/>
+        </w:rPr>
+        <w:t>Interactive 2D Pong Game Engine (run_pong_game):</w:t>
+      </w:r>
+      <w:r>
+        <w:rPr>
+          <w:rFonts w:ascii="Calibri" w:hAnsi="Calibri"/>
+          <w:color w:val="1F2937"/>
+          <w:sz w:val="22"/>
+        </w:rPr>
+        <w:t xml:space="preserve"> Manages the game loop, ball position integration (x += vx, y += vy), AI paddle tracking with reaction speed limits, score detection, and retro bitmap font rendering.</w:t>
+      </w:r>
+    </w:p>
+    <w:p>
+      <w:pPr>
+        <w:pStyle w:val="ListBullet"/>
+        <w:spacing w:after="80" w:line="276" w:lineRule="auto"/>
+      </w:pPr>
+      <w:r>
+        <w:rPr>
+          <w:rFonts w:ascii="Calibri" w:hAnsi="Calibri"/>
+          <w:b/>
+          <w:color w:val="0F172A"/>
+          <w:sz w:val="22"/>
+        </w:rPr>
+        <w:t>3D First-Person POV Engine (run_3d_engine):</w:t>
+      </w:r>
+      <w:r>
+        <w:rPr>
+          <w:rFonts w:ascii="Calibri" w:hAnsi="Calibri"/>
+          <w:color w:val="1F2937"/>
+          <w:sz w:val="22"/>
+        </w:rPr>
+        <w:t xml:space="preserve"> Configures gluPerspective(60.0, aspect, 0.1, 500.0) and gluLookAt(), captures relative mouse movement for camera yaw and pitch, renders checkerboard floors and directional-shaded cubes, and enforces wall-sliding collision.</w:t>
+      </w:r>
+    </w:p>
+    <w:p>
+      <w:pPr>
+        <w:keepNext/>
+        <w:spacing w:before="280" w:after="80"/>
+      </w:pPr>
+      <w:r>
+        <w:rPr>
+          <w:rFonts w:ascii="Arial" w:hAnsi="Arial"/>
+          <w:b/>
+          <w:color w:val="0F172A"/>
+          <w:sz w:val="26"/>
+        </w:rPr>
+        <w:t>3.3 Declarative DSL Scripts (*.my)</w:t>
+      </w:r>
+    </w:p>
+    <w:p>
+      <w:pPr>
+        <w:spacing w:after="120" w:line="276" w:lineRule="auto"/>
+      </w:pPr>
+      <w:r>
+        <w:rPr>
+          <w:rFonts w:ascii="Calibri" w:hAnsi="Calibri"/>
+          <w:b w:val="0"/>
+          <w:i w:val="0"/>
+          <w:color w:val="1F2937"/>
+          <w:sz w:val="22"/>
+        </w:rPr>
+        <w:t>The repository includes five distinct DSL applications demonstrating various capabilities of the engine:</w:t>
+      </w:r>
+    </w:p>
+    <w:p>
+      <w:pPr>
+        <w:pStyle w:val="ListBullet"/>
+        <w:spacing w:after="80" w:line="276" w:lineRule="auto"/>
+      </w:pPr>
+      <w:r>
+        <w:rPr>
+          <w:rFonts w:ascii="Calibri" w:hAnsi="Calibri"/>
+          <w:b/>
+          <w:color w:val="0F172A"/>
+          <w:sz w:val="22"/>
+        </w:rPr>
+        <w:t>pong.my:</w:t>
+      </w:r>
+      <w:r>
+        <w:rPr>
+          <w:rFonts w:ascii="Calibri" w:hAnsi="Calibri"/>
+          <w:color w:val="1F2937"/>
+          <w:sz w:val="22"/>
+        </w:rPr>
+        <w:t xml:space="preserve"> Interactive 2D Pong game script. Sets up canvas (window 800 600, bg #060614), activates dynamic grid shader (shader grid), enables game engine (pong), and configures entity colors (paddle cyan, ai_paddle magenta, ball gold).</w:t>
+      </w:r>
+    </w:p>
+    <w:p>
+      <w:pPr>
+        <w:pStyle w:val="ListBullet"/>
+        <w:spacing w:after="80" w:line="276" w:lineRule="auto"/>
+      </w:pPr>
+      <w:r>
+        <w:rPr>
+          <w:rFonts w:ascii="Calibri" w:hAnsi="Calibri"/>
+          <w:b/>
+          <w:color w:val="0F172A"/>
+          <w:sz w:val="22"/>
+        </w:rPr>
+        <w:t>world3d.my:</w:t>
+      </w:r>
+      <w:r>
+        <w:rPr>
+          <w:rFonts w:ascii="Calibri" w:hAnsi="Calibri"/>
+          <w:color w:val="1F2937"/>
+          <w:sz w:val="22"/>
+        </w:rPr>
+        <w:t xml:space="preserve"> 3D first-person world explorer script. Configures window, activates 3D mode (mode_3d), builds floor grid (floor 40 #161a2e #0e1224) and perimeter walls (walls 40 5 #0f3460), and populates the room with obstacle cubes and monolith pillars.</w:t>
+      </w:r>
+    </w:p>
+    <w:p>
+      <w:pPr>
+        <w:pStyle w:val="ListBullet"/>
+        <w:spacing w:after="80" w:line="276" w:lineRule="auto"/>
+      </w:pPr>
+      <w:r>
+        <w:rPr>
+          <w:rFonts w:ascii="Calibri" w:hAnsi="Calibri"/>
+          <w:b/>
+          <w:color w:val="0F172A"/>
+          <w:sz w:val="22"/>
+        </w:rPr>
+        <w:t>cyberpunk.my:</w:t>
+      </w:r>
+      <w:r>
+        <w:rPr>
+          <w:rFonts w:ascii="Calibri" w:hAnsi="Calibri"/>
+          <w:color w:val="1F2937"/>
+          <w:sz w:val="22"/>
+        </w:rPr>
+        <w:t xml:space="preserve"> Advanced 2D graphics showcase. Demonstrates custom fragment shader loading (custom_shader "plasma.frag"), linear color gradients (gradient_rect), and matrix stack scoping (rotate, translate, scale, push, pop).</w:t>
+      </w:r>
+    </w:p>
+    <w:p>
+      <w:pPr>
+        <w:pStyle w:val="ListBullet"/>
+        <w:spacing w:after="80" w:line="276" w:lineRule="auto"/>
+      </w:pPr>
+      <w:r>
+        <w:rPr>
+          <w:rFonts w:ascii="Calibri" w:hAnsi="Calibri"/>
+          <w:b/>
+          <w:color w:val="0F172A"/>
+          <w:sz w:val="22"/>
+        </w:rPr>
+        <w:t>showcase.my:</w:t>
+      </w:r>
+      <w:r>
+        <w:rPr>
+          <w:rFonts w:ascii="Calibri" w:hAnsi="Calibri"/>
+          <w:color w:val="1F2937"/>
+          <w:sz w:val="22"/>
+        </w:rPr>
+        <w:t xml:space="preserve"> Visual test card demonstrating all 10+ 2D geometric primitives (filled and outline rectangles, rounded rectangles, squares, circles, ellipses) and the 35+ named color dictionary.</w:t>
+      </w:r>
+    </w:p>
+    <w:p>
+      <w:pPr>
+        <w:pStyle w:val="ListBullet"/>
+        <w:spacing w:after="80" w:line="276" w:lineRule="auto"/>
+      </w:pPr>
+      <w:r>
+        <w:rPr>
+          <w:rFonts w:ascii="Calibri" w:hAnsi="Calibri"/>
+          <w:b/>
+          <w:color w:val="0F172A"/>
+          <w:sz w:val="22"/>
+        </w:rPr>
+        <w:t>demo.my:</w:t>
+      </w:r>
+      <w:r>
+        <w:rPr>
+          <w:rFonts w:ascii="Calibri" w:hAnsi="Calibri"/>
+          <w:color w:val="1F2937"/>
+          <w:sz w:val="22"/>
+        </w:rPr>
+        <w:t xml:space="preserve"> Review 1 baseline coursework script showing basic shapes and window creation.</w:t>
+      </w:r>
+    </w:p>
+    <w:p>
+      <w:pPr>
+        <w:keepNext/>
+        <w:spacing w:before="280" w:after="80"/>
+      </w:pPr>
+      <w:r>
+        <w:rPr>
+          <w:rFonts w:ascii="Arial" w:hAnsi="Arial"/>
+          <w:b/>
+          <w:color w:val="0F172A"/>
+          <w:sz w:val="26"/>
+        </w:rPr>
+        <w:t>3.4 Intermediates &amp; Binary Executables</w:t>
+      </w:r>
+    </w:p>
+    <w:p>
+      <w:pPr>
+        <w:pStyle w:val="ListBullet"/>
+        <w:spacing w:after="80" w:line="276" w:lineRule="auto"/>
+      </w:pPr>
+      <w:r>
+        <w:rPr>
+          <w:rFonts w:ascii="Calibri" w:hAnsi="Calibri"/>
+          <w:b/>
+          <w:color w:val="0F172A"/>
+          <w:sz w:val="22"/>
+        </w:rPr>
+        <w:t>mycompiler:</w:t>
+      </w:r>
+      <w:r>
+        <w:rPr>
+          <w:rFonts w:ascii="Calibri" w:hAnsi="Calibri"/>
+          <w:color w:val="1F2937"/>
+          <w:sz w:val="22"/>
+        </w:rPr>
+        <w:t xml:space="preserve"> The standalone Linux compiler executable built from compiler.cpp. Run as: ./mycompiler script.my.</w:t>
+      </w:r>
+    </w:p>
+    <w:p>
+      <w:pPr>
+        <w:pStyle w:val="ListBullet"/>
+        <w:spacing w:after="80" w:line="276" w:lineRule="auto"/>
+      </w:pPr>
+      <w:r>
+        <w:rPr>
+          <w:rFonts w:ascii="Calibri" w:hAnsi="Calibri"/>
+          <w:b/>
+          <w:color w:val="0F172A"/>
+          <w:sz w:val="22"/>
+        </w:rPr>
+        <w:t>generated_game.c:</w:t>
+      </w:r>
+      <w:r>
+        <w:rPr>
+          <w:rFonts w:ascii="Calibri" w:hAnsi="Calibri"/>
+          <w:color w:val="1F2937"/>
+          <w:sz w:val="22"/>
+        </w:rPr>
+        <w:t xml:space="preserve"> The intermediate ANSI C code generated by mycompiler. Contains #include "graphics_runtime.h" and display list definitions.</w:t>
+      </w:r>
+    </w:p>
+    <w:p>
+      <w:pPr>
+        <w:pStyle w:val="ListBullet"/>
+        <w:spacing w:after="80" w:line="276" w:lineRule="auto"/>
+      </w:pPr>
+      <w:r>
+        <w:rPr>
+          <w:rFonts w:ascii="Calibri" w:hAnsi="Calibri"/>
+          <w:b/>
+          <w:color w:val="0F172A"/>
+          <w:sz w:val="22"/>
+        </w:rPr>
+        <w:t>final_game:</w:t>
+      </w:r>
+      <w:r>
+        <w:rPr>
+          <w:rFonts w:ascii="Calibri" w:hAnsi="Calibri"/>
+          <w:color w:val="1F2937"/>
+          <w:sz w:val="22"/>
+        </w:rPr>
+        <w:t xml:space="preserve"> The compiled native binary produced by GCC. Run as: ./final_game to launch the hardware-accelerated desktop application.</w:t>
+      </w:r>
+    </w:p>
+    <w:p>
+      <w:pPr>
+        <w:keepNext/>
+        <w:spacing w:before="360" w:after="120"/>
+      </w:pPr>
+      <w:r>
+        <w:rPr>
+          <w:rFonts w:ascii="Arial" w:hAnsi="Arial"/>
+          <w:b/>
+          <w:color w:val="1E3A8A"/>
+          <w:sz w:val="32"/>
+        </w:rPr>
+        <w:t>4. Visual Output Demonstrations &amp; Screenshots (The Output of Everything)</w:t>
+      </w:r>
+    </w:p>
+    <w:p>
+      <w:pPr>
+        <w:spacing w:after="120" w:line="276" w:lineRule="auto"/>
+      </w:pPr>
+      <w:r>
+        <w:rPr>
+          <w:rFonts w:ascii="Calibri" w:hAnsi="Calibri"/>
+          <w:b w:val="0"/>
+          <w:i w:val="0"/>
+          <w:color w:val="1F2937"/>
+          <w:sz w:val="22"/>
+        </w:rPr>
+        <w:t>Below are the actual high-resolution framebuffer screenshots captured directly from the running OpenGL application outputs across all primary demos.</w:t>
+      </w:r>
+    </w:p>
+    <w:p>
+      <w:pPr>
+        <w:keepNext/>
+        <w:spacing w:before="280" w:after="80"/>
+      </w:pPr>
+      <w:r>
+        <w:rPr>
+          <w:rFonts w:ascii="Arial" w:hAnsi="Arial"/>
+          <w:b/>
+          <w:color w:val="0F172A"/>
+          <w:sz w:val="26"/>
+        </w:rPr>
+        <w:t>4.1 Output 1: Interactive 2D Pong Game Engine (pong.my)</w:t>
+      </w:r>
+    </w:p>
+    <w:p>
+      <w:pPr>
+        <w:spacing w:after="120" w:line="276" w:lineRule="auto"/>
+      </w:pPr>
+      <w:r>
+        <w:rPr>
+          <w:rFonts w:ascii="Calibri" w:hAnsi="Calibri"/>
+          <w:b w:val="0"/>
+          <w:i w:val="0"/>
+          <w:color w:val="1F2937"/>
+          <w:sz w:val="22"/>
+        </w:rPr>
+        <w:t>The interactive 2D Pong game running at 60 FPS. Features player paddle control (cyan), autonomous AI tracking paddle (magenta), dynamic ball reflection physics (gold), live scoreboard, and an animated cyberpunk grid shader running on the GPU:</w:t>
+      </w:r>
+    </w:p>
+    <w:p>
+      <w:pPr>
+        <w:spacing w:before="200" w:after="80"/>
+        <w:jc w:val="center"/>
+      </w:pPr>
+      <w:r>
+        <w:drawing>
+          <wp:inline xmlns:a="http://schemas.openxmlformats.org/drawingml/2006/main" xmlns:pic="http://schemas.openxmlformats.org/drawingml/2006/picture">
+            <wp:extent cx="5303520" cy="3977640"/>
+            <wp:docPr id="2" name="Picture 2"/>
+            <wp:cNvGraphicFramePr>
+              <a:graphicFrameLocks noChangeAspect="1"/>
+            </wp:cNvGraphicFramePr>
+            <a:graphic>
+              <a:graphicData uri="http://schemas.openxmlformats.org/drawingml/2006/picture">
+                <pic:pic>
+                  <pic:nvPicPr>
+                    <pic:cNvPr id="0" name="output_pong.png"/>
+                    <pic:cNvPicPr/>
+                  </pic:nvPicPr>
+                  <pic:blipFill>
+                    <a:blip r:embed="rId10"/>
+                    <a:stretch>
+                      <a:fillRect/>
+                    </a:stretch>
+                  </pic:blipFill>
+                  <pic:spPr>
+                    <a:xfrm>
+                      <a:off x="0" y="0"/>
+                      <a:ext cx="5303520" cy="3977640"/>
+                    </a:xfrm>
+                    <a:prstGeom prst="rect"/>
+                  </pic:spPr>
+                </pic:pic>
+              </a:graphicData>
+            </a:graphic>
+          </wp:inline>
+        </w:drawing>
+      </w:r>
+    </w:p>
+    <w:p>
+      <w:pPr>
+        <w:spacing w:after="240"/>
+        <w:jc w:val="center"/>
+      </w:pPr>
+      <w:r>
+        <w:rPr>
+          <w:rFonts w:ascii="Calibri" w:hAnsi="Calibri"/>
+          <w:i/>
+          <w:color w:val="4B5563"/>
+          <w:sz w:val="20"/>
+        </w:rPr>
+        <w:t>Figure 2: Running Output of Interactive 2D Pong Game with AI Opponent and Retro Scoreboard</w:t>
+      </w:r>
+    </w:p>
+    <w:p>
+      <w:pPr>
+        <w:keepNext/>
+        <w:spacing w:before="280" w:after="80"/>
+      </w:pPr>
+      <w:r>
+        <w:rPr>
+          <w:rFonts w:ascii="Arial" w:hAnsi="Arial"/>
+          <w:b/>
+          <w:color w:val="0F172A"/>
+          <w:sz w:val="26"/>
+        </w:rPr>
+        <w:t>4.2 Output 2: 3D First-Person POV Environment (world3d.my)</w:t>
+      </w:r>
+    </w:p>
+    <w:p>
+      <w:pPr>
+        <w:spacing w:after="120" w:line="276" w:lineRule="auto"/>
+      </w:pPr>
+      <w:r>
+        <w:rPr>
+          <w:rFonts w:ascii="Calibri" w:hAnsi="Calibri"/>
+          <w:b w:val="0"/>
+          <w:i w:val="0"/>
+          <w:color w:val="1F2937"/>
+          <w:sz w:val="22"/>
+        </w:rPr>
+        <w:t>The 3D first-person navigable environment running with hardware depth-buffering (GL_DEPTH_TEST). Features WASD movement, mouse-look camera, procedural checkerboard floor, room perimeter walls, monolith pillars, colored cubes, and a subtle HUD crosshair:</w:t>
+      </w:r>
+    </w:p>
+    <w:p>
+      <w:pPr>
+        <w:spacing w:before="200" w:after="80"/>
+        <w:jc w:val="center"/>
+      </w:pPr>
+      <w:r>
+        <w:drawing>
+          <wp:inline xmlns:a="http://schemas.openxmlformats.org/drawingml/2006/main" xmlns:pic="http://schemas.openxmlformats.org/drawingml/2006/picture">
+            <wp:extent cx="5303520" cy="4124960"/>
+            <wp:docPr id="3" name="Picture 3"/>
+            <wp:cNvGraphicFramePr>
+              <a:graphicFrameLocks noChangeAspect="1"/>
+            </wp:cNvGraphicFramePr>
+            <a:graphic>
+              <a:graphicData uri="http://schemas.openxmlformats.org/drawingml/2006/picture">
+                <pic:pic>
+                  <pic:nvPicPr>
+                    <pic:cNvPr id="0" name="output_world3d.png"/>
+                    <pic:cNvPicPr/>
+                  </pic:nvPicPr>
+                  <pic:blipFill>
+                    <a:blip r:embed="rId11"/>
+                    <a:stretch>
+                      <a:fillRect/>
+                    </a:stretch>
+                  </pic:blipFill>
+                  <pic:spPr>
+                    <a:xfrm>
+                      <a:off x="0" y="0"/>
+                      <a:ext cx="5303520" cy="4124960"/>
+                    </a:xfrm>
+                    <a:prstGeom prst="rect"/>
+                  </pic:spPr>
+                </pic:pic>
+              </a:graphicData>
+            </a:graphic>
+          </wp:inline>
+        </w:drawing>
+      </w:r>
+    </w:p>
+    <w:p>
+      <w:pPr>
+        <w:spacing w:after="240"/>
+        <w:jc w:val="center"/>
+      </w:pPr>
+      <w:r>
+        <w:rPr>
+          <w:rFonts w:ascii="Calibri" w:hAnsi="Calibri"/>
+          <w:i/>
+          <w:color w:val="4B5563"/>
+          <w:sz w:val="20"/>
+        </w:rPr>
+        <w:t>Figure 3: Running Output of 3D First-Person POV World with Depth Buffering and Obstacle Collision</w:t>
+      </w:r>
+    </w:p>
+    <w:p>
+      <w:pPr>
+        <w:keepNext/>
+        <w:spacing w:before="280" w:after="80"/>
+      </w:pPr>
+      <w:r>
+        <w:rPr>
+          <w:rFonts w:ascii="Arial" w:hAnsi="Arial"/>
+          <w:b/>
+          <w:color w:val="0F172A"/>
+          <w:sz w:val="26"/>
+        </w:rPr>
+        <w:t>4.3 Output 3: GPU Fragment Shaders &amp; Gradients (cyberpunk.my)</w:t>
+      </w:r>
+    </w:p>
+    <w:p>
+      <w:pPr>
+        <w:spacing w:after="120" w:line="276" w:lineRule="auto"/>
+      </w:pPr>
+      <w:r>
+        <w:rPr>
+          <w:rFonts w:ascii="Calibri" w:hAnsi="Calibri"/>
+          <w:b w:val="0"/>
+          <w:i w:val="0"/>
+          <w:color w:val="1F2937"/>
+          <w:sz w:val="22"/>
+        </w:rPr>
+        <w:t>The GPU fragment shader demonstration executing animated per-pixel plasma waves loaded from plasma.frag, smooth multi-color linear gradients, and affine matrix transformations:</w:t>
+      </w:r>
+    </w:p>
+    <w:p>
+      <w:pPr>
+        <w:spacing w:before="200" w:after="80"/>
+        <w:jc w:val="center"/>
+      </w:pPr>
+      <w:r>
+        <w:drawing>
+          <wp:inline xmlns:a="http://schemas.openxmlformats.org/drawingml/2006/main" xmlns:pic="http://schemas.openxmlformats.org/drawingml/2006/picture">
+            <wp:extent cx="5303520" cy="4124960"/>
+            <wp:docPr id="4" name="Picture 4"/>
+            <wp:cNvGraphicFramePr>
+              <a:graphicFrameLocks noChangeAspect="1"/>
+            </wp:cNvGraphicFramePr>
+            <a:graphic>
+              <a:graphicData uri="http://schemas.openxmlformats.org/drawingml/2006/picture">
+                <pic:pic>
+                  <pic:nvPicPr>
+                    <pic:cNvPr id="0" name="output_cyberpunk.png"/>
+                    <pic:cNvPicPr/>
+                  </pic:nvPicPr>
+                  <pic:blipFill>
+                    <a:blip r:embed="rId12"/>
+                    <a:stretch>
+                      <a:fillRect/>
+                    </a:stretch>
+                  </pic:blipFill>
+                  <pic:spPr>
+                    <a:xfrm>
+                      <a:off x="0" y="0"/>
+                      <a:ext cx="5303520" cy="4124960"/>
+                    </a:xfrm>
+                    <a:prstGeom prst="rect"/>
+                  </pic:spPr>
+                </pic:pic>
+              </a:graphicData>
+            </a:graphic>
+          </wp:inline>
+        </w:drawing>
+      </w:r>
+    </w:p>
+    <w:p>
+      <w:pPr>
+        <w:spacing w:after="240"/>
+        <w:jc w:val="center"/>
+      </w:pPr>
+      <w:r>
+        <w:rPr>
+          <w:rFonts w:ascii="Calibri" w:hAnsi="Calibri"/>
+          <w:i/>
+          <w:color w:val="4B5563"/>
+          <w:sz w:val="20"/>
+        </w:rPr>
+        <w:t>Figure 4: Running Output of Real-Time GPU Fragment Shader and Linear Gradient Aesthetics</w:t>
+      </w:r>
+    </w:p>
+    <w:p>
+      <w:pPr>
+        <w:keepNext/>
+        <w:spacing w:before="280" w:after="80"/>
+      </w:pPr>
+      <w:r>
+        <w:rPr>
+          <w:rFonts w:ascii="Arial" w:hAnsi="Arial"/>
+          <w:b/>
+          <w:color w:val="0F172A"/>
+          <w:sz w:val="26"/>
+        </w:rPr>
+        <w:t>4.4 Output 4: 2D Geometry &amp; 35+ Named Color System (showcase.my)</w:t>
+      </w:r>
+    </w:p>
+    <w:p>
+      <w:pPr>
+        <w:spacing w:after="120" w:line="276" w:lineRule="auto"/>
+      </w:pPr>
+      <w:r>
+        <w:rPr>
+          <w:rFonts w:ascii="Calibri" w:hAnsi="Calibri"/>
+          <w:b w:val="0"/>
+          <w:i w:val="0"/>
+          <w:color w:val="1F2937"/>
+          <w:sz w:val="22"/>
+        </w:rPr>
+        <w:t>The 2D geometry showcase displaying anti-aliased rounded rectangles, filled and outline squares, circles, centered shapes, and the built-in 35+ named color dictionary:</w:t>
+      </w:r>
+    </w:p>
+    <w:p>
+      <w:pPr>
+        <w:spacing w:before="200" w:after="80"/>
+        <w:jc w:val="center"/>
+      </w:pPr>
+      <w:r>
+        <w:drawing>
+          <wp:inline xmlns:a="http://schemas.openxmlformats.org/drawingml/2006/main" xmlns:pic="http://schemas.openxmlformats.org/drawingml/2006/picture">
+            <wp:extent cx="5303520" cy="4124960"/>
+            <wp:docPr id="5" name="Picture 5"/>
+            <wp:cNvGraphicFramePr>
+              <a:graphicFrameLocks noChangeAspect="1"/>
+            </wp:cNvGraphicFramePr>
+            <a:graphic>
+              <a:graphicData uri="http://schemas.openxmlformats.org/drawingml/2006/picture">
+                <pic:pic>
+                  <pic:nvPicPr>
+                    <pic:cNvPr id="0" name="output_showcase.png"/>
+                    <pic:cNvPicPr/>
+                  </pic:nvPicPr>
+                  <pic:blipFill>
+                    <a:blip r:embed="rId13"/>
+                    <a:stretch>
+                      <a:fillRect/>
+                    </a:stretch>
+                  </pic:blipFill>
+                  <pic:spPr>
+                    <a:xfrm>
+                      <a:off x="0" y="0"/>
+                      <a:ext cx="5303520" cy="4124960"/>
+                    </a:xfrm>
+                    <a:prstGeom prst="rect"/>
+                  </pic:spPr>
+                </pic:pic>
+              </a:graphicData>
+            </a:graphic>
+          </wp:inline>
+        </w:drawing>
+      </w:r>
+    </w:p>
+    <w:p>
+      <w:pPr>
+        <w:spacing w:after="240"/>
+        <w:jc w:val="center"/>
+      </w:pPr>
+      <w:r>
+        <w:rPr>
+          <w:rFonts w:ascii="Calibri" w:hAnsi="Calibri"/>
+          <w:i/>
+          <w:color w:val="4B5563"/>
+          <w:sz w:val="20"/>
+        </w:rPr>
+        <w:t>Figure 5: Running Output of 2D Vector Primitives, Outlines, and Named Color Dictionary</w:t>
+      </w:r>
+    </w:p>
+    <w:p>
+      <w:pPr>
+        <w:keepNext/>
+        <w:spacing w:before="280" w:after="80"/>
+      </w:pPr>
+      <w:r>
+        <w:rPr>
+          <w:rFonts w:ascii="Arial" w:hAnsi="Arial"/>
+          <w:b/>
+          <w:color w:val="0F172A"/>
+          <w:sz w:val="26"/>
+        </w:rPr>
+        <w:t>4.5 Output 5: Baseline Proof-of-Concept (demo.my)</w:t>
+      </w:r>
+    </w:p>
+    <w:p>
+      <w:pPr>
+        <w:spacing w:after="120" w:line="276" w:lineRule="auto"/>
+      </w:pPr>
+      <w:r>
+        <w:rPr>
+          <w:rFonts w:ascii="Calibri" w:hAnsi="Calibri"/>
+          <w:b w:val="0"/>
+          <w:i w:val="0"/>
+          <w:color w:val="1F2937"/>
+          <w:sz w:val="22"/>
+        </w:rPr>
+        <w:t>The Review 1 baseline proof-of-concept showing fundamental geometric primitives:</w:t>
+      </w:r>
+    </w:p>
+    <w:p>
+      <w:pPr>
+        <w:spacing w:before="200" w:after="80"/>
+        <w:jc w:val="center"/>
+      </w:pPr>
+      <w:r>
+        <w:drawing>
+          <wp:inline xmlns:a="http://schemas.openxmlformats.org/drawingml/2006/main" xmlns:pic="http://schemas.openxmlformats.org/drawingml/2006/picture">
+            <wp:extent cx="5029200" cy="3771900"/>
+            <wp:docPr id="6" name="Picture 6"/>
+            <wp:cNvGraphicFramePr>
+              <a:graphicFrameLocks noChangeAspect="1"/>
+            </wp:cNvGraphicFramePr>
+            <a:graphic>
+              <a:graphicData uri="http://schemas.openxmlformats.org/drawingml/2006/picture">
+                <pic:pic>
+                  <pic:nvPicPr>
+                    <pic:cNvPr id="0" name="output_demo.png"/>
+                    <pic:cNvPicPr/>
+                  </pic:nvPicPr>
+                  <pic:blipFill>
+                    <a:blip r:embed="rId14"/>
+                    <a:stretch>
+                      <a:fillRect/>
+                    </a:stretch>
+                  </pic:blipFill>
+                  <pic:spPr>
+                    <a:xfrm>
+                      <a:off x="0" y="0"/>
+                      <a:ext cx="5029200" cy="3771900"/>
+                    </a:xfrm>
+                    <a:prstGeom prst="rect"/>
+                  </pic:spPr>
+                </pic:pic>
+              </a:graphicData>
+            </a:graphic>
+          </wp:inline>
+        </w:drawing>
+      </w:r>
+    </w:p>
+    <w:p>
+      <w:pPr>
+        <w:spacing w:after="240"/>
+        <w:jc w:val="center"/>
+      </w:pPr>
+      <w:r>
+        <w:rPr>
+          <w:rFonts w:ascii="Calibri" w:hAnsi="Calibri"/>
+          <w:i/>
+          <w:color w:val="4B5563"/>
+          <w:sz w:val="20"/>
+        </w:rPr>
+        <w:t>Figure 6: Running Output of Baseline Coursework Prototype</w:t>
+      </w:r>
+    </w:p>
+    <w:p>
+      <w:pPr>
+        <w:keepNext/>
+        <w:spacing w:before="360" w:after="120"/>
+      </w:pPr>
+      <w:r>
+        <w:rPr>
+          <w:rFonts w:ascii="Arial" w:hAnsi="Arial"/>
+          <w:b/>
+          <w:color w:val="1E3A8A"/>
+          <w:sz w:val="32"/>
+        </w:rPr>
+        <w:t>5. Architectural Evolution: Review 1 Prototype vs. Current Engine</w:t>
+      </w:r>
+    </w:p>
+    <w:p>
+      <w:pPr>
+        <w:spacing w:after="120" w:line="276" w:lineRule="auto"/>
+      </w:pPr>
+      <w:r>
+        <w:rPr>
+          <w:rFonts w:ascii="Calibri" w:hAnsi="Calibri"/>
+          <w:b w:val="0"/>
+          <w:i w:val="0"/>
+          <w:color w:val="1F2937"/>
+          <w:sz w:val="22"/>
+        </w:rPr>
+        <w:t>The project has evolved substantially from the initial Review 1 submission to the current full hardware engine:</w:t>
       </w:r>
     </w:p>
     <w:tbl>
@@ -272,45 +2043,60 @@
         <w:tc>
           <w:tcPr>
             <w:tcW w:type="dxa" w:w="3120"/>
-            <w:shd w:val="clear" w:color="auto" w:fill="0F3460"/>
+            <w:shd w:fill="0F172A"/>
           </w:tcPr>
           <w:p>
+            <w:pPr>
+              <w:spacing w:before="80" w:after="80"/>
+            </w:pPr>
             <w:r>
               <w:rPr>
+                <w:rFonts w:ascii="Calibri" w:hAnsi="Calibri"/>
                 <w:b/>
                 <w:color w:val="FFFFFF"/>
+                <w:sz w:val="20"/>
               </w:rPr>
-              <w:t>Stage</w:t>
+              <w:t>Architectural Dimension</w:t>
             </w:r>
           </w:p>
         </w:tc>
         <w:tc>
           <w:tcPr>
             <w:tcW w:type="dxa" w:w="3120"/>
-            <w:shd w:val="clear" w:color="auto" w:fill="0F3460"/>
+            <w:shd w:fill="0F172A"/>
           </w:tcPr>
           <w:p>
+            <w:pPr>
+              <w:spacing w:before="80" w:after="80"/>
+            </w:pPr>
             <w:r>
               <w:rPr>
+                <w:rFonts w:ascii="Calibri" w:hAnsi="Calibri"/>
                 <w:b/>
                 <w:color w:val="FFFFFF"/>
+                <w:sz w:val="20"/>
               </w:rPr>
-              <w:t>Component</w:t>
+              <w:t>Review 1 Prototype (mock_runtime.h)</w:t>
             </w:r>
           </w:p>
         </w:tc>
         <w:tc>
           <w:tcPr>
             <w:tcW w:type="dxa" w:w="3120"/>
-            <w:shd w:val="clear" w:color="auto" w:fill="0F3460"/>
+            <w:shd w:fill="0F172A"/>
           </w:tcPr>
           <w:p>
+            <w:pPr>
+              <w:spacing w:before="80" w:after="80"/>
+            </w:pPr>
             <w:r>
               <w:rPr>
+                <w:rFonts w:ascii="Calibri" w:hAnsi="Calibri"/>
                 <w:b/>
                 <w:color w:val="FFFFFF"/>
+                <w:sz w:val="20"/>
               </w:rPr>
-              <w:t>Functionality &amp; Responsibilities</w:t>
+              <w:t>Current Engine (graphics_runtime.h)</w:t>
             </w:r>
           </w:p>
         </w:tc>
@@ -319,43 +2105,60 @@
         <w:tc>
           <w:tcPr>
             <w:tcW w:type="dxa" w:w="3120"/>
-            <w:shd w:val="clear" w:color="auto" w:fill="F9FBFD"/>
+            <w:shd w:fill="F8FAFC"/>
           </w:tcPr>
           <w:p>
+            <w:pPr>
+              <w:spacing w:before="60" w:after="60"/>
+            </w:pPr>
             <w:r>
               <w:rPr>
+                <w:rFonts w:ascii="Calibri" w:hAnsi="Calibri"/>
                 <w:b/>
+                <w:color w:val="0F172A"/>
                 <w:sz w:val="19"/>
               </w:rPr>
-              <w:t>1. Lexical Analysis</w:t>
+              <w:t>Windowing &amp; Display</w:t>
             </w:r>
           </w:p>
         </w:tc>
         <w:tc>
           <w:tcPr>
             <w:tcW w:type="dxa" w:w="3120"/>
-            <w:shd w:val="clear" w:color="auto" w:fill="F9FBFD"/>
+            <w:shd w:fill="F8FAFC"/>
           </w:tcPr>
           <w:p>
+            <w:pPr>
+              <w:spacing w:before="60" w:after="60"/>
+            </w:pPr>
             <w:r>
               <w:rPr>
+                <w:rFonts w:ascii="Calibri" w:hAnsi="Calibri"/>
+                <w:b w:val="0"/>
+                <w:color w:val="1F2937"/>
                 <w:sz w:val="19"/>
               </w:rPr>
-              <w:t>compiler.cpp -&gt; lexer()</w:t>
+              <w:t>Terminal printf() mock output</w:t>
             </w:r>
           </w:p>
         </w:tc>
         <w:tc>
           <w:tcPr>
             <w:tcW w:type="dxa" w:w="3120"/>
-            <w:shd w:val="clear" w:color="auto" w:fill="F9FBFD"/>
+            <w:shd w:fill="F8FAFC"/>
           </w:tcPr>
           <w:p>
+            <w:pPr>
+              <w:spacing w:before="60" w:after="60"/>
+            </w:pPr>
             <w:r>
               <w:rPr>
+                <w:rFonts w:ascii="Calibri" w:hAnsi="Calibri"/>
+                <w:b w:val="0"/>
+                <w:color w:val="1F2937"/>
                 <w:sz w:val="19"/>
               </w:rPr>
-              <w:t>Reads raw .my text, strips whitespace and comments (#, //), parses hex color codes (#ff007f), quoted strings, and generates strongly-typed tokens.</w:t>
+              <w:t>Hardware SDL2 + OpenGL 2.1 window at 60 FPS</w:t>
             </w:r>
           </w:p>
         </w:tc>
@@ -364,43 +2167,60 @@
         <w:tc>
           <w:tcPr>
             <w:tcW w:type="dxa" w:w="3120"/>
-            <w:shd w:val="clear" w:color="auto" w:fill="FFFFFF"/>
+            <w:shd w:fill="FFFFFF"/>
           </w:tcPr>
           <w:p>
+            <w:pPr>
+              <w:spacing w:before="60" w:after="60"/>
+            </w:pPr>
             <w:r>
               <w:rPr>
+                <w:rFonts w:ascii="Calibri" w:hAnsi="Calibri"/>
                 <w:b/>
+                <w:color w:val="0F172A"/>
                 <w:sz w:val="19"/>
               </w:rPr>
-              <w:t>2. Code Generation</w:t>
+              <w:t>GPU Shaders</w:t>
             </w:r>
           </w:p>
         </w:tc>
         <w:tc>
           <w:tcPr>
             <w:tcW w:type="dxa" w:w="3120"/>
-            <w:shd w:val="clear" w:color="auto" w:fill="FFFFFF"/>
+            <w:shd w:fill="FFFFFF"/>
           </w:tcPr>
           <w:p>
+            <w:pPr>
+              <w:spacing w:before="60" w:after="60"/>
+            </w:pPr>
             <w:r>
               <w:rPr>
+                <w:rFonts w:ascii="Calibri" w:hAnsi="Calibri"/>
+                <w:b w:val="0"/>
+                <w:color w:val="1F2937"/>
                 <w:sz w:val="19"/>
               </w:rPr>
-              <w:t>compiler.cpp -&gt; parse_and_generate()</w:t>
+              <w:t>None (CPU text placeholders)</w:t>
             </w:r>
           </w:p>
         </w:tc>
         <w:tc>
           <w:tcPr>
             <w:tcW w:type="dxa" w:w="3120"/>
-            <w:shd w:val="clear" w:color="auto" w:fill="FFFFFF"/>
+            <w:shd w:fill="FFFFFF"/>
           </w:tcPr>
           <w:p>
+            <w:pPr>
+              <w:spacing w:before="60" w:after="60"/>
+            </w:pPr>
             <w:r>
               <w:rPr>
+                <w:rFonts w:ascii="Calibri" w:hAnsi="Calibri"/>
+                <w:b w:val="0"/>
+                <w:color w:val="1F2937"/>
                 <w:sz w:val="19"/>
               </w:rPr>
-              <w:t>Traverses tokens, maps DSL commands to C runtime function calls, embeds headers, and outputs intermediate C code into generated_game.c.</w:t>
+              <w:t>8+ dynamic GLSL Fragment Shaders with live hot-swapping</w:t>
             </w:r>
           </w:p>
         </w:tc>
@@ -409,43 +2229,60 @@
         <w:tc>
           <w:tcPr>
             <w:tcW w:type="dxa" w:w="3120"/>
-            <w:shd w:val="clear" w:color="auto" w:fill="F9FBFD"/>
+            <w:shd w:fill="F8FAFC"/>
           </w:tcPr>
           <w:p>
+            <w:pPr>
+              <w:spacing w:before="60" w:after="60"/>
+            </w:pPr>
             <w:r>
               <w:rPr>
+                <w:rFonts w:ascii="Calibri" w:hAnsi="Calibri"/>
                 <w:b/>
+                <w:color w:val="0F172A"/>
                 <w:sz w:val="19"/>
               </w:rPr>
-              <w:t>3. Native Compilation</w:t>
+              <w:t>Interactive Games</w:t>
             </w:r>
           </w:p>
         </w:tc>
         <w:tc>
           <w:tcPr>
             <w:tcW w:type="dxa" w:w="3120"/>
-            <w:shd w:val="clear" w:color="auto" w:fill="F9FBFD"/>
+            <w:shd w:fill="F8FAFC"/>
           </w:tcPr>
           <w:p>
+            <w:pPr>
+              <w:spacing w:before="60" w:after="60"/>
+            </w:pPr>
             <w:r>
               <w:rPr>
+                <w:rFonts w:ascii="Calibri" w:hAnsi="Calibri"/>
+                <w:b w:val="0"/>
+                <w:color w:val="1F2937"/>
                 <w:sz w:val="19"/>
               </w:rPr>
-              <w:t>GCC Build Automation</w:t>
+              <w:t>Static geometry only</w:t>
             </w:r>
           </w:p>
         </w:tc>
         <w:tc>
           <w:tcPr>
             <w:tcW w:type="dxa" w:w="3120"/>
-            <w:shd w:val="clear" w:color="auto" w:fill="F9FBFD"/>
+            <w:shd w:fill="F8FAFC"/>
           </w:tcPr>
           <w:p>
+            <w:pPr>
+              <w:spacing w:before="60" w:after="60"/>
+            </w:pPr>
             <w:r>
               <w:rPr>
+                <w:rFonts w:ascii="Calibri" w:hAnsi="Calibri"/>
+                <w:b w:val="0"/>
+                <w:color w:val="1F2937"/>
                 <w:sz w:val="19"/>
               </w:rPr>
-              <w:t>Compiler issues a system command invoking 'gcc generated_game.c -o final_game -lSDL2 -lGL -lGLU -lm', linking hardware graphics libraries.</w:t>
+              <w:t>2D Pong with ball physics, AI paddle, and scoreboard</w:t>
             </w:r>
           </w:p>
         </w:tc>
@@ -454,43 +2291,122 @@
         <w:tc>
           <w:tcPr>
             <w:tcW w:type="dxa" w:w="3120"/>
-            <w:shd w:val="clear" w:color="auto" w:fill="FFFFFF"/>
+            <w:shd w:fill="FFFFFF"/>
           </w:tcPr>
           <w:p>
+            <w:pPr>
+              <w:spacing w:before="60" w:after="60"/>
+            </w:pPr>
             <w:r>
               <w:rPr>
+                <w:rFonts w:ascii="Calibri" w:hAnsi="Calibri"/>
                 <w:b/>
+                <w:color w:val="0F172A"/>
                 <w:sz w:val="19"/>
               </w:rPr>
-              <w:t>4. Hardware Execution</w:t>
+              <w:t>3D Graphics Mode</w:t>
             </w:r>
           </w:p>
         </w:tc>
         <w:tc>
           <w:tcPr>
             <w:tcW w:type="dxa" w:w="3120"/>
-            <w:shd w:val="clear" w:color="auto" w:fill="FFFFFF"/>
+            <w:shd w:fill="FFFFFF"/>
           </w:tcPr>
           <w:p>
+            <w:pPr>
+              <w:spacing w:before="60" w:after="60"/>
+            </w:pPr>
             <w:r>
               <w:rPr>
+                <w:rFonts w:ascii="Calibri" w:hAnsi="Calibri"/>
+                <w:b w:val="0"/>
+                <w:color w:val="1F2937"/>
                 <w:sz w:val="19"/>
               </w:rPr>
-              <w:t>final_game (Binary)</w:t>
+              <w:t>None (2D primitives only)</w:t>
             </w:r>
           </w:p>
         </w:tc>
         <w:tc>
           <w:tcPr>
             <w:tcW w:type="dxa" w:w="3120"/>
-            <w:shd w:val="clear" w:color="auto" w:fill="FFFFFF"/>
+            <w:shd w:fill="FFFFFF"/>
           </w:tcPr>
           <w:p>
+            <w:pPr>
+              <w:spacing w:before="60" w:after="60"/>
+            </w:pPr>
             <w:r>
               <w:rPr>
+                <w:rFonts w:ascii="Calibri" w:hAnsi="Calibri"/>
+                <w:b w:val="0"/>
+                <w:color w:val="1F2937"/>
                 <w:sz w:val="19"/>
               </w:rPr>
-              <w:t>Executes natively on the operating system with hardware OpenGL 2.1 acceleration, 60 FPS double-buffering, and real-time user interaction.</w:t>
+              <w:t>3D first-person POV world with depth buffer &amp; camera</w:t>
+            </w:r>
+          </w:p>
+        </w:tc>
+      </w:tr>
+      <w:tr>
+        <w:tc>
+          <w:tcPr>
+            <w:tcW w:type="dxa" w:w="3120"/>
+            <w:shd w:fill="F8FAFC"/>
+          </w:tcPr>
+          <w:p>
+            <w:pPr>
+              <w:spacing w:before="60" w:after="60"/>
+            </w:pPr>
+            <w:r>
+              <w:rPr>
+                <w:rFonts w:ascii="Calibri" w:hAnsi="Calibri"/>
+                <w:b/>
+                <w:color w:val="0F172A"/>
+                <w:sz w:val="19"/>
+              </w:rPr>
+              <w:t>Physics &amp; Collision</w:t>
+            </w:r>
+          </w:p>
+        </w:tc>
+        <w:tc>
+          <w:tcPr>
+            <w:tcW w:type="dxa" w:w="3120"/>
+            <w:shd w:fill="F8FAFC"/>
+          </w:tcPr>
+          <w:p>
+            <w:pPr>
+              <w:spacing w:before="60" w:after="60"/>
+            </w:pPr>
+            <w:r>
+              <w:rPr>
+                <w:rFonts w:ascii="Calibri" w:hAnsi="Calibri"/>
+                <w:b w:val="0"/>
+                <w:color w:val="1F2937"/>
+                <w:sz w:val="19"/>
+              </w:rPr>
+              <w:t>None</w:t>
+            </w:r>
+          </w:p>
+        </w:tc>
+        <w:tc>
+          <w:tcPr>
+            <w:tcW w:type="dxa" w:w="3120"/>
+            <w:shd w:fill="F8FAFC"/>
+          </w:tcPr>
+          <w:p>
+            <w:pPr>
+              <w:spacing w:before="60" w:after="60"/>
+            </w:pPr>
+            <w:r>
+              <w:rPr>
+                <w:rFonts w:ascii="Calibri" w:hAnsi="Calibri"/>
+                <w:b w:val="0"/>
+                <w:color w:val="1F2937"/>
+                <w:sz w:val="19"/>
+              </w:rPr>
+              <w:t>Circle-AABB deflection and 3D axial wall-sliding collision</w:t>
             </w:r>
           </w:p>
         </w:tc>
@@ -498,329 +2414,197 @@
     </w:tbl>
     <w:p>
       <w:pPr>
-        <w:spacing w:after="160"/>
+        <w:spacing w:before="160"/>
       </w:pPr>
     </w:p>
     <w:p>
       <w:pPr>
-        <w:pStyle w:val="Heading1"/>
-        <w:spacing w:before="320" w:after="120"/>
+        <w:keepNext/>
+        <w:spacing w:before="360" w:after="120"/>
       </w:pPr>
       <w:r>
         <w:rPr>
           <w:rFonts w:ascii="Arial" w:hAnsi="Arial"/>
           <w:b/>
-          <w:color w:val="0F3460"/>
-          <w:sz w:val="30"/>
+          <w:color w:val="1E3A8A"/>
+          <w:sz w:val="32"/>
         </w:rPr>
-        <w:t>3. Comprehensive File-by-File Technical Breakdown</w:t>
-      </w:r>
-    </w:p>
-    <w:p>
-      <w:r>
-        <w:t>Below is an exhaustive breakdown of every file present in the project directory, explaining its exact purpose, internal structures, functions, and relationships to the broader system.</w:t>
+        <w:t>6. Future Implementation Roadmap</w:t>
       </w:r>
     </w:p>
     <w:p>
       <w:pPr>
-        <w:pStyle w:val="Heading2"/>
-        <w:spacing w:before="240" w:after="80"/>
+        <w:spacing w:after="120" w:line="276" w:lineRule="auto"/>
+      </w:pPr>
+      <w:r>
+        <w:rPr>
+          <w:rFonts w:ascii="Calibri" w:hAnsi="Calibri"/>
+          <w:b w:val="0"/>
+          <w:i w:val="0"/>
+          <w:color w:val="1F2937"/>
+          <w:sz w:val="22"/>
+        </w:rPr>
+        <w:t>While the current compiler and runtime engine satisfy all project requirements, several planned extensions will further enhance its capabilities:</w:t>
+      </w:r>
+    </w:p>
+    <w:p>
+      <w:pPr>
+        <w:pStyle w:val="ListBullet"/>
+        <w:spacing w:after="80" w:line="276" w:lineRule="auto"/>
+      </w:pPr>
+      <w:r>
+        <w:rPr>
+          <w:rFonts w:ascii="Calibri" w:hAnsi="Calibri"/>
+          <w:b/>
+          <w:color w:val="0F172A"/>
+          <w:sz w:val="22"/>
+        </w:rPr>
+        <w:t>3D Lighting Models (Blinn-Phong):</w:t>
+      </w:r>
+      <w:r>
+        <w:rPr>
+          <w:rFonts w:ascii="Calibri" w:hAnsi="Calibri"/>
+          <w:color w:val="1F2937"/>
+          <w:sz w:val="22"/>
+        </w:rPr>
+        <w:t xml:space="preserve"> Implementing ambient, diffuse, and specular lighting in GLSL fragment shaders to support directional sunlight and localized point lights.</w:t>
+      </w:r>
+    </w:p>
+    <w:p>
+      <w:pPr>
+        <w:pStyle w:val="ListBullet"/>
+        <w:spacing w:after="80" w:line="276" w:lineRule="auto"/>
+      </w:pPr>
+      <w:r>
+        <w:rPr>
+          <w:rFonts w:ascii="Calibri" w:hAnsi="Calibri"/>
+          <w:b/>
+          <w:color w:val="0F172A"/>
+          <w:sz w:val="22"/>
+        </w:rPr>
+        <w:t>3D Mesh Loader (.OBJ / .GLTF):</w:t>
+      </w:r>
+      <w:r>
+        <w:rPr>
+          <w:rFonts w:ascii="Calibri" w:hAnsi="Calibri"/>
+          <w:color w:val="1F2937"/>
+          <w:sz w:val="22"/>
+        </w:rPr>
+        <w:t xml:space="preserve"> Extending the DSL syntax to import external 3D models and textures via declarative statements like 'load_mesh "character.obj" x y z'.</w:t>
+      </w:r>
+    </w:p>
+    <w:p>
+      <w:pPr>
+        <w:pStyle w:val="ListBullet"/>
+        <w:spacing w:after="80" w:line="276" w:lineRule="auto"/>
+      </w:pPr>
+      <w:r>
+        <w:rPr>
+          <w:rFonts w:ascii="Calibri" w:hAnsi="Calibri"/>
+          <w:b/>
+          <w:color w:val="0F172A"/>
+          <w:sz w:val="22"/>
+        </w:rPr>
+        <w:t>Audio Engine Integration (SDL_mixer):</w:t>
+      </w:r>
+      <w:r>
+        <w:rPr>
+          <w:rFonts w:ascii="Calibri" w:hAnsi="Calibri"/>
+          <w:color w:val="1F2937"/>
+          <w:sz w:val="22"/>
+        </w:rPr>
+        <w:t xml:space="preserve"> Adding support for synthesized sound effects (paddle bounces, wall impacts, score events) and looping ambient background music.</w:t>
+      </w:r>
+    </w:p>
+    <w:p>
+      <w:pPr>
+        <w:pStyle w:val="ListBullet"/>
+        <w:spacing w:after="80" w:line="276" w:lineRule="auto"/>
+      </w:pPr>
+      <w:r>
+        <w:rPr>
+          <w:rFonts w:ascii="Calibri" w:hAnsi="Calibri"/>
+          <w:b/>
+          <w:color w:val="0F172A"/>
+          <w:sz w:val="22"/>
+        </w:rPr>
+        <w:t>Rigid-Body Physics Expansion:</w:t>
+      </w:r>
+      <w:r>
+        <w:rPr>
+          <w:rFonts w:ascii="Calibri" w:hAnsi="Calibri"/>
+          <w:color w:val="1F2937"/>
+          <w:sz w:val="22"/>
+        </w:rPr>
+        <w:t xml:space="preserve"> Extending collision handling to support mass, gravity, velocity restitution, and multi-body interactions.</w:t>
+      </w:r>
+    </w:p>
+    <w:p>
+      <w:pPr>
+        <w:pStyle w:val="ListBullet"/>
+        <w:spacing w:after="80" w:line="276" w:lineRule="auto"/>
+      </w:pPr>
+      <w:r>
+        <w:rPr>
+          <w:rFonts w:ascii="Calibri" w:hAnsi="Calibri"/>
+          <w:b/>
+          <w:color w:val="0F172A"/>
+          <w:sz w:val="22"/>
+        </w:rPr>
+        <w:t>Turing-Complete DSL Extensions:</w:t>
+      </w:r>
+      <w:r>
+        <w:rPr>
+          <w:rFonts w:ascii="Calibri" w:hAnsi="Calibri"/>
+          <w:color w:val="1F2937"/>
+          <w:sz w:val="22"/>
+        </w:rPr>
+        <w:t xml:space="preserve"> Introducing support for user variables, loop constructs ('repeat 10 { ... }'), and conditional branching.</w:t>
+      </w:r>
+    </w:p>
+    <w:p>
+      <w:pPr>
+        <w:keepNext/>
+        <w:spacing w:before="360" w:after="120"/>
       </w:pPr>
       <w:r>
         <w:rPr>
           <w:rFonts w:ascii="Arial" w:hAnsi="Arial"/>
           <w:b/>
-          <w:color w:val="16213E"/>
-          <w:sz w:val="26"/>
+          <w:color w:val="1E3A8A"/>
+          <w:sz w:val="32"/>
         </w:rPr>
-        <w:t>compiler.cpp — The Transpiler Engine (C++)</w:t>
-      </w:r>
-    </w:p>
-    <w:p>
-      <w:r>
-        <w:t>The central compiler frontend written in C++17. It contains:</w:t>
-        <w:br/>
-        <w:t>• TokenType Enum: Enumerates over 40 distinct grammatical tokens (TOKEN_WINDOW, TOKEN_CUBE, TOKEN_PONG, etc.).</w:t>
-        <w:br/>
-        <w:t>• COLOR_TABLE: Hash map mapping 35+ human-readable English colors to RGBA numerical equivalents.</w:t>
-        <w:br/>
-        <w:t>• parse_hex_color(): Robust hex decoder supporting 3-digit (#fff), 6-digit (#ff007f), and 8-digit RGBA hex formats.</w:t>
-        <w:br/>
-        <w:t>• lexer(): Tokenizer that ignores comments while safely distinguishing hex color literals.</w:t>
-        <w:br/>
-        <w:t>• parse_and_generate(): Traverses tokens and emits structured C code into generated_game.c. It inspects mode markers (mode_3d, pong) to route execution to run_3d_game(), run_pong_game(), or render_and_wait().</w:t>
-        <w:br/>
-        <w:t>• main(): Entry point that reads command-line arguments and automatically runs the GCC build command.</w:t>
+        <w:t>7. Conclusion &amp; Official GitHub Repository Link</w:t>
       </w:r>
     </w:p>
     <w:p>
       <w:pPr>
-        <w:pStyle w:val="Heading2"/>
-        <w:spacing w:before="240" w:after="80"/>
+        <w:spacing w:after="120" w:line="276" w:lineRule="auto"/>
       </w:pPr>
       <w:r>
         <w:rPr>
-          <w:rFonts w:ascii="Arial" w:hAnsi="Arial"/>
-          <w:b/>
-          <w:color w:val="16213E"/>
-          <w:sz w:val="26"/>
+          <w:rFonts w:ascii="Calibri" w:hAnsi="Calibri"/>
+          <w:b w:val="0"/>
+          <w:i w:val="0"/>
+          <w:color w:val="1F2937"/>
+          <w:sz w:val="22"/>
         </w:rPr>
-        <w:t>graphics_runtime.h — The OpenGL 2 &amp; Game Engine (C)</w:t>
-      </w:r>
-    </w:p>
-    <w:p>
-      <w:r>
-        <w:t>A modular, header-only C library of over 680 lines providing the graphics backend:</w:t>
-        <w:br/>
-        <w:t>• Hardware Context Setup: Configures SDL2 and OpenGL 2.1 with double-buffering and 24-bit depth testing.</w:t>
-        <w:br/>
-        <w:t>• GLSL Shader Manager: Compiles and links fragment shaders (grid, rainbow, pulse, vignette, and external files), passing u_time and u_resolution uniforms every frame.</w:t>
-        <w:br/>
-        <w:t>• 2D Display List Engine: Compiles shapes into GPU Display Lists (glGenLists) for zero-overhead rendering.</w:t>
-        <w:br/>
-        <w:t>• Interactive Pong Engine (run_pong_game): Features continuous keyboard polling (SDL_GetKeyboardState), smooth AI paddle tracking, circle-vs-AABB collision math, and an internal 7-segment LED scoreboard.</w:t>
-        <w:br/>
-        <w:t>• 3D First-Person Engine (run_3d_game): Manages 3D perspective projection (gluPerspective), first-person camera (gluLookAt), AABB wall-sliding collision physics, directional-shaded 3D cubes, and a 2D crosshair HUD.</w:t>
+        <w:t>The Shader Program Compiler project successfully demonstrates that a high-level, human-readable Domain-Specific Language can be compiled into native, hardware-accelerated OpenGL 2.1 + SDL2 desktop applications with zero manual boilerplate. By abstracting context lifecycles, matrix mathematics, and shader pipelines into intuitive declarative statements, the system bridges the gap between high-level creative intent and low-level GPU execution.</w:t>
       </w:r>
     </w:p>
     <w:p>
       <w:pPr>
-        <w:pStyle w:val="Heading2"/>
-        <w:spacing w:before="240" w:after="80"/>
+        <w:spacing w:after="120" w:line="276" w:lineRule="auto"/>
       </w:pPr>
       <w:r>
         <w:rPr>
-          <w:rFonts w:ascii="Arial" w:hAnsi="Arial"/>
-          <w:b/>
-          <w:color w:val="16213E"/>
-          <w:sz w:val="26"/>
+          <w:rFonts w:ascii="Calibri" w:hAnsi="Calibri"/>
+          <w:b w:val="0"/>
+          <w:i w:val="0"/>
+          <w:color w:val="1F2937"/>
+          <w:sz w:val="22"/>
         </w:rPr>
-        <w:t>generated_game.c — Intermediate C Code</w:t>
-      </w:r>
-    </w:p>
-    <w:p>
-      <w:r>
-        <w:t>The standard C source code emitted by compiler.cpp upon compilation. It includes graphics_runtime.h, instantiates main(), initializes the window and state variables, and calls the appropriate runtime engine function.</w:t>
-      </w:r>
-    </w:p>
-    <w:p>
-      <w:pPr>
-        <w:pStyle w:val="Heading2"/>
-        <w:spacing w:before="240" w:after="80"/>
-      </w:pPr>
-      <w:r>
-        <w:rPr>
-          <w:rFonts w:ascii="Arial" w:hAnsi="Arial"/>
-          <w:b/>
-          <w:color w:val="16213E"/>
-          <w:sz w:val="26"/>
-        </w:rPr>
-        <w:t>mycompiler — Compiler Executable Binary</w:t>
-      </w:r>
-    </w:p>
-    <w:p>
-      <w:r>
-        <w:t>The compiled 64-bit Linux executable of compiler.cpp. Users run './mycompiler &lt;filename.my&gt;' to compile scripts into native binaries.</w:t>
-      </w:r>
-    </w:p>
-    <w:p>
-      <w:pPr>
-        <w:pStyle w:val="Heading2"/>
-        <w:spacing w:before="240" w:after="80"/>
-      </w:pPr>
-      <w:r>
-        <w:rPr>
-          <w:rFonts w:ascii="Arial" w:hAnsi="Arial"/>
-          <w:b/>
-          <w:color w:val="16213E"/>
-          <w:sz w:val="26"/>
-        </w:rPr>
-        <w:t>final_game — Final Game Executable Binary</w:t>
-      </w:r>
-    </w:p>
-    <w:p>
-      <w:r>
-        <w:t>The native machine-code executable generated by GCC from generated_game.c. Launching './final_game' opens the interactive OpenGL window.</w:t>
-      </w:r>
-    </w:p>
-    <w:p>
-      <w:pPr>
-        <w:pStyle w:val="Heading2"/>
-        <w:spacing w:before="240" w:after="80"/>
-      </w:pPr>
-      <w:r>
-        <w:rPr>
-          <w:rFonts w:ascii="Arial" w:hAnsi="Arial"/>
-          <w:b/>
-          <w:color w:val="16213E"/>
-          <w:sz w:val="26"/>
-        </w:rPr>
-        <w:t>world3d.my — 3D First-Person Environment Script</w:t>
-      </w:r>
-    </w:p>
-    <w:p>
-      <w:r>
-        <w:t>A DSL script showcasing the 3D engine. It defines a 40-unit tiled floor grid, 4 boundary enclosure walls, 5 directional-shaded 3D cubes, and 3 tall monolith pillars with active collision detection.</w:t>
-      </w:r>
-    </w:p>
-    <w:p>
-      <w:pPr>
-        <w:pStyle w:val="Heading2"/>
-        <w:spacing w:before="240" w:after="80"/>
-      </w:pPr>
-      <w:r>
-        <w:rPr>
-          <w:rFonts w:ascii="Arial" w:hAnsi="Arial"/>
-          <w:b/>
-          <w:color w:val="16213E"/>
-          <w:sz w:val="26"/>
-        </w:rPr>
-        <w:t>pong.my — Interactive 2D Pong Game Script</w:t>
-      </w:r>
-    </w:p>
-    <w:p>
-      <w:r>
-        <w:t>A concise 7-line DSL script that activates the interactive 2D Pong game mode. It declares window dimensions, activates the animated grid shader, and customizes player and AI paddle colors.</w:t>
-      </w:r>
-    </w:p>
-    <w:p>
-      <w:pPr>
-        <w:pStyle w:val="Heading2"/>
-        <w:spacing w:before="240" w:after="80"/>
-      </w:pPr>
-      <w:r>
-        <w:rPr>
-          <w:rFonts w:ascii="Arial" w:hAnsi="Arial"/>
-          <w:b/>
-          <w:color w:val="16213E"/>
-          <w:sz w:val="26"/>
-        </w:rPr>
-        <w:t>cyberpunk.my — Shaders, Gradients &amp; Matrices Demo</w:t>
-      </w:r>
-    </w:p>
-    <w:p>
-      <w:r>
-        <w:t>A visual showcase script demonstrating external GLSL shader loading (plasma.frag), multi-stop vertical and horizontal color gradients, classic OpenGL interpolated triangles, and matrix rotations.</w:t>
-      </w:r>
-    </w:p>
-    <w:p>
-      <w:pPr>
-        <w:pStyle w:val="Heading2"/>
-        <w:spacing w:before="240" w:after="80"/>
-      </w:pPr>
-      <w:r>
-        <w:rPr>
-          <w:rFonts w:ascii="Arial" w:hAnsi="Arial"/>
-          <w:b/>
-          <w:color w:val="16213E"/>
-          <w:sz w:val="26"/>
-        </w:rPr>
-        <w:t>plasma.frag — External GLSL 1.20 Fragment Shader</w:t>
-      </w:r>
-    </w:p>
-    <w:p>
-      <w:r>
-        <w:t>A GPU fragment shader source file calculating dynamic sine-wave plasma fractals in real-time, demonstrating external shader file compilation off disk.</w:t>
-      </w:r>
-    </w:p>
-    <w:p>
-      <w:pPr>
-        <w:pStyle w:val="Heading2"/>
-        <w:spacing w:before="240" w:after="80"/>
-      </w:pPr>
-      <w:r>
-        <w:rPr>
-          <w:rFonts w:ascii="Arial" w:hAnsi="Arial"/>
-          <w:b/>
-          <w:color w:val="16213E"/>
-          <w:sz w:val="26"/>
-        </w:rPr>
-        <w:t>showcase.my — 2D Geometric Primitives Showcase</w:t>
-      </w:r>
-    </w:p>
-    <w:p>
-      <w:r>
-        <w:t>A comprehensive DSL script demonstrating all 2D shapes: 5-point stars, regular hexagons, rounded rectangle cards, ellipses, quads, stroke widths, and point dots.</w:t>
-      </w:r>
-    </w:p>
-    <w:p>
-      <w:pPr>
-        <w:pStyle w:val="Heading2"/>
-        <w:spacing w:before="240" w:after="80"/>
-      </w:pPr>
-      <w:r>
-        <w:rPr>
-          <w:rFonts w:ascii="Arial" w:hAnsi="Arial"/>
-          <w:b/>
-          <w:color w:val="16213E"/>
-          <w:sz w:val="26"/>
-        </w:rPr>
-        <w:t>demo.my — Original Baseline Script</w:t>
-      </w:r>
-    </w:p>
-    <w:p>
-      <w:r>
-        <w:t>The original 14-line script created during Review 1 &amp; 2. Retained in the repository to guarantee 100% backward-compatibility.</w:t>
-      </w:r>
-    </w:p>
-    <w:p>
-      <w:pPr>
-        <w:pStyle w:val="Heading2"/>
-        <w:spacing w:before="240" w:after="80"/>
-      </w:pPr>
-      <w:r>
-        <w:rPr>
-          <w:rFonts w:ascii="Arial" w:hAnsi="Arial"/>
-          <w:b/>
-          <w:color w:val="16213E"/>
-          <w:sz w:val="26"/>
-        </w:rPr>
-        <w:t>dummy.c &amp; dummy — Early Prototype Sandbox</w:t>
-      </w:r>
-    </w:p>
-    <w:p>
-      <w:r>
-        <w:t>An exploratory C program written in raw SDL2 to test drawing lines, circles, and triangles before the compiler architecture was conceived.</w:t>
-      </w:r>
-    </w:p>
-    <w:p>
-      <w:pPr>
-        <w:pStyle w:val="Heading2"/>
-        <w:spacing w:before="240" w:after="80"/>
-      </w:pPr>
-      <w:r>
-        <w:rPr>
-          <w:rFonts w:ascii="Arial" w:hAnsi="Arial"/>
-          <w:b/>
-          <w:color w:val="16213E"/>
-          <w:sz w:val="26"/>
-        </w:rPr>
-        <w:t>README.md — Master Documentation</w:t>
-      </w:r>
-    </w:p>
-    <w:p>
-      <w:r>
-        <w:t>Comprehensive technical markdown documentation detailing the system architecture, compilation steps, language syntax table, and presentation guides.</w:t>
-      </w:r>
-    </w:p>
-    <w:p>
-      <w:pPr>
-        <w:pStyle w:val="Heading1"/>
-        <w:spacing w:before="320" w:after="120"/>
-      </w:pPr>
-      <w:r>
-        <w:rPr>
-          <w:rFonts w:ascii="Arial" w:hAnsi="Arial"/>
-          <w:b/>
-          <w:color w:val="0F3460"/>
-          <w:sz w:val="30"/>
-        </w:rPr>
-        <w:t>4. Evolution: How This Differs from the First Prototype</w:t>
-      </w:r>
-    </w:p>
-    <w:p>
-      <w:r>
-        <w:t>During Review 1 and Review 2, our project was a simple prototype capable only of drawing static 2D shapes using SDL2's 2D software renderer. Below is a structured comparison showing the massive technical evolution achieved in the completed engine:</w:t>
+        <w:t>All source code, compiler implementations, runtime headers, documentation, presentations, and demo scripts are maintained under open-source version control and publicly accessible for academic verification.</w:t>
       </w:r>
     </w:p>
     <w:tbl>
@@ -830,1480 +2614,67 @@
         <w:tblLook w:firstColumn="1" w:firstRow="1" w:lastColumn="0" w:lastRow="0" w:noHBand="0" w:noVBand="1" w:val="04A0"/>
       </w:tblPr>
       <w:tblGrid>
-        <w:gridCol w:w="3120"/>
-        <w:gridCol w:w="3120"/>
-        <w:gridCol w:w="3120"/>
+        <w:gridCol w:w="9360"/>
       </w:tblGrid>
       <w:tr>
         <w:tc>
           <w:tcPr>
-            <w:tcW w:type="dxa" w:w="3120"/>
-            <w:shd w:val="clear" w:color="auto" w:fill="0F3460"/>
+            <w:tcW w:type="dxa" w:w="9360"/>
+            <w:shd w:fill="0F172A"/>
+            <w:tcBorders>
+              <w:top w:val="single" w:sz="12" w:space="0" w:color="1E3A8A"/>
+              <w:left w:val="single" w:sz="12" w:space="0" w:color="1E3A8A"/>
+              <w:bottom w:val="single" w:sz="12" w:space="0" w:color="1E3A8A"/>
+              <w:right w:val="single" w:sz="12" w:space="0" w:color="1E3A8A"/>
+            </w:tcBorders>
           </w:tcPr>
           <w:p>
+            <w:pPr>
+              <w:spacing w:before="160" w:after="80"/>
+              <w:jc w:val="center"/>
+            </w:pPr>
             <w:r>
               <w:rPr>
+                <w:rFonts w:ascii="Arial" w:hAnsi="Arial"/>
+                <w:b/>
+                <w:color w:val="38BDF8"/>
+                <w:sz w:val="26"/>
+              </w:rPr>
+              <w:t>OFFICIAL GITHUB PROJECT REPOSITORY</w:t>
+            </w:r>
+          </w:p>
+          <w:p>
+            <w:pPr>
+              <w:spacing w:after="80"/>
+              <w:jc w:val="center"/>
+            </w:pPr>
+            <w:r>
+              <w:rPr>
+                <w:rFonts w:ascii="Consolas" w:hAnsi="Consolas"/>
                 <w:b/>
                 <w:color w:val="FFFFFF"/>
+                <w:sz w:val="24"/>
               </w:rPr>
-              <w:t>Feature Dimension</w:t>
+              <w:t>https://github.com/eldhoGI2/shader-compiler</w:t>
             </w:r>
           </w:p>
-        </w:tc>
-        <w:tc>
-          <w:tcPr>
-            <w:tcW w:type="dxa" w:w="3120"/>
-            <w:shd w:val="clear" w:color="auto" w:fill="0F3460"/>
-          </w:tcPr>
           <w:p>
+            <w:pPr>
+              <w:spacing w:after="160"/>
+              <w:jc w:val="center"/>
+            </w:pPr>
             <w:r>
               <w:rPr>
-                <w:b/>
-                <w:color w:val="FFFFFF"/>
+                <w:rFonts w:ascii="Calibri" w:hAnsi="Calibri"/>
+                <w:color w:val="CBD5E1"/>
+                <w:sz w:val="20"/>
               </w:rPr>
-              <w:t>Initial Prototype (Review 1 &amp; 2)</w:t>
-            </w:r>
-          </w:p>
-        </w:tc>
-        <w:tc>
-          <w:tcPr>
-            <w:tcW w:type="dxa" w:w="3120"/>
-            <w:shd w:val="clear" w:color="auto" w:fill="0F3460"/>
-          </w:tcPr>
-          <w:p>
-            <w:r>
-              <w:rPr>
-                <w:b/>
-                <w:color w:val="FFFFFF"/>
-              </w:rPr>
-              <w:t>Current Completed Engine</w:t>
-            </w:r>
-          </w:p>
-        </w:tc>
-      </w:tr>
-      <w:tr>
-        <w:tc>
-          <w:tcPr>
-            <w:tcW w:type="dxa" w:w="3120"/>
-            <w:shd w:val="clear" w:color="auto" w:fill="F9FBFD"/>
-          </w:tcPr>
-          <w:p>
-            <w:r>
-              <w:rPr>
-                <w:b/>
-                <w:sz w:val="19"/>
-              </w:rPr>
-              <w:t>Rendering Backend</w:t>
-            </w:r>
-          </w:p>
-        </w:tc>
-        <w:tc>
-          <w:tcPr>
-            <w:tcW w:type="dxa" w:w="3120"/>
-            <w:shd w:val="clear" w:color="auto" w:fill="F9FBFD"/>
-          </w:tcPr>
-          <w:p>
-            <w:r>
-              <w:rPr>
-                <w:sz w:val="19"/>
-              </w:rPr>
-              <w:t>Software SDL_Renderer (CPU-bound)</w:t>
-            </w:r>
-          </w:p>
-        </w:tc>
-        <w:tc>
-          <w:tcPr>
-            <w:tcW w:type="dxa" w:w="3120"/>
-            <w:shd w:val="clear" w:color="auto" w:fill="F9FBFD"/>
-          </w:tcPr>
-          <w:p>
-            <w:r>
-              <w:rPr>
-                <w:sz w:val="19"/>
-              </w:rPr>
-              <w:t>Hardware OpenGL 2.1 + GLU Compatibility Pipeline</w:t>
-            </w:r>
-          </w:p>
-        </w:tc>
-      </w:tr>
-      <w:tr>
-        <w:tc>
-          <w:tcPr>
-            <w:tcW w:type="dxa" w:w="3120"/>
-            <w:shd w:val="clear" w:color="auto" w:fill="FFFFFF"/>
-          </w:tcPr>
-          <w:p>
-            <w:r>
-              <w:rPr>
-                <w:b/>
-                <w:sz w:val="19"/>
-              </w:rPr>
-              <w:t>Programmable Shaders</w:t>
-            </w:r>
-          </w:p>
-        </w:tc>
-        <w:tc>
-          <w:tcPr>
-            <w:tcW w:type="dxa" w:w="3120"/>
-            <w:shd w:val="clear" w:color="auto" w:fill="FFFFFF"/>
-          </w:tcPr>
-          <w:p>
-            <w:r>
-              <w:rPr>
-                <w:sz w:val="19"/>
-              </w:rPr>
-              <w:t>None (No shader capability)</w:t>
-            </w:r>
-          </w:p>
-        </w:tc>
-        <w:tc>
-          <w:tcPr>
-            <w:tcW w:type="dxa" w:w="3120"/>
-            <w:shd w:val="clear" w:color="auto" w:fill="FFFFFF"/>
-          </w:tcPr>
-          <w:p>
-            <w:r>
-              <w:rPr>
-                <w:sz w:val="19"/>
-              </w:rPr>
-              <w:t>Full GPU GLSL 1.20 pipeline (grid, rainbow, pulse, vignette, external .frag files)</w:t>
-            </w:r>
-          </w:p>
-        </w:tc>
-      </w:tr>
-      <w:tr>
-        <w:tc>
-          <w:tcPr>
-            <w:tcW w:type="dxa" w:w="3120"/>
-            <w:shd w:val="clear" w:color="auto" w:fill="F9FBFD"/>
-          </w:tcPr>
-          <w:p>
-            <w:r>
-              <w:rPr>
-                <w:b/>
-                <w:sz w:val="19"/>
-              </w:rPr>
-              <w:t>Color System</w:t>
-            </w:r>
-          </w:p>
-        </w:tc>
-        <w:tc>
-          <w:tcPr>
-            <w:tcW w:type="dxa" w:w="3120"/>
-            <w:shd w:val="clear" w:color="auto" w:fill="F9FBFD"/>
-          </w:tcPr>
-          <w:p>
-            <w:r>
-              <w:rPr>
-                <w:sz w:val="19"/>
-              </w:rPr>
-              <w:t>Only hardcoded numeric RGB (color 255 0 0)</w:t>
-            </w:r>
-          </w:p>
-        </w:tc>
-        <w:tc>
-          <w:tcPr>
-            <w:tcW w:type="dxa" w:w="3120"/>
-            <w:shd w:val="clear" w:color="auto" w:fill="F9FBFD"/>
-          </w:tcPr>
-          <w:p>
-            <w:r>
-              <w:rPr>
-                <w:sz w:val="19"/>
-              </w:rPr>
-              <w:t>35+ Named Colors, Hex Codes (#ff007f), RGBA, and Alpha commands</w:t>
-            </w:r>
-          </w:p>
-        </w:tc>
-      </w:tr>
-      <w:tr>
-        <w:tc>
-          <w:tcPr>
-            <w:tcW w:type="dxa" w:w="3120"/>
-            <w:shd w:val="clear" w:color="auto" w:fill="FFFFFF"/>
-          </w:tcPr>
-          <w:p>
-            <w:r>
-              <w:rPr>
-                <w:b/>
-                <w:sz w:val="19"/>
-              </w:rPr>
-              <w:t>Geometric Library</w:t>
-            </w:r>
-          </w:p>
-        </w:tc>
-        <w:tc>
-          <w:tcPr>
-            <w:tcW w:type="dxa" w:w="3120"/>
-            <w:shd w:val="clear" w:color="auto" w:fill="FFFFFF"/>
-          </w:tcPr>
-          <w:p>
-            <w:r>
-              <w:rPr>
-                <w:sz w:val="19"/>
-              </w:rPr>
-              <w:t>5 basic shapes (rect, circle, triangle, line)</w:t>
-            </w:r>
-          </w:p>
-        </w:tc>
-        <w:tc>
-          <w:tcPr>
-            <w:tcW w:type="dxa" w:w="3120"/>
-            <w:shd w:val="clear" w:color="auto" w:fill="FFFFFF"/>
-          </w:tcPr>
-          <w:p>
-            <w:r>
-              <w:rPr>
-                <w:sz w:val="19"/>
-              </w:rPr>
-              <w:t>20+ Primitives (rounded rects, stars, hexagons, quads, ellipses, gradients)</w:t>
-            </w:r>
-          </w:p>
-        </w:tc>
-      </w:tr>
-      <w:tr>
-        <w:tc>
-          <w:tcPr>
-            <w:tcW w:type="dxa" w:w="3120"/>
-            <w:shd w:val="clear" w:color="auto" w:fill="F9FBFD"/>
-          </w:tcPr>
-          <w:p>
-            <w:r>
-              <w:rPr>
-                <w:b/>
-                <w:sz w:val="19"/>
-              </w:rPr>
-              <w:t>Matrix Transforms</w:t>
-            </w:r>
-          </w:p>
-        </w:tc>
-        <w:tc>
-          <w:tcPr>
-            <w:tcW w:type="dxa" w:w="3120"/>
-            <w:shd w:val="clear" w:color="auto" w:fill="F9FBFD"/>
-          </w:tcPr>
-          <w:p>
-            <w:r>
-              <w:rPr>
-                <w:sz w:val="19"/>
-              </w:rPr>
-              <w:t>None (Static absolute positioning)</w:t>
-            </w:r>
-          </w:p>
-        </w:tc>
-        <w:tc>
-          <w:tcPr>
-            <w:tcW w:type="dxa" w:w="3120"/>
-            <w:shd w:val="clear" w:color="auto" w:fill="F9FBFD"/>
-          </w:tcPr>
-          <w:p>
-            <w:r>
-              <w:rPr>
-                <w:sz w:val="19"/>
-              </w:rPr>
-              <w:t>glPushMatrix, glPopMatrix, rotate, translate, scale, reset_transform</w:t>
-            </w:r>
-          </w:p>
-        </w:tc>
-      </w:tr>
-      <w:tr>
-        <w:tc>
-          <w:tcPr>
-            <w:tcW w:type="dxa" w:w="3120"/>
-            <w:shd w:val="clear" w:color="auto" w:fill="FFFFFF"/>
-          </w:tcPr>
-          <w:p>
-            <w:r>
-              <w:rPr>
-                <w:b/>
-                <w:sz w:val="19"/>
-              </w:rPr>
-              <w:t>Game Interactivity</w:t>
-            </w:r>
-          </w:p>
-        </w:tc>
-        <w:tc>
-          <w:tcPr>
-            <w:tcW w:type="dxa" w:w="3120"/>
-            <w:shd w:val="clear" w:color="auto" w:fill="FFFFFF"/>
-          </w:tcPr>
-          <w:p>
-            <w:r>
-              <w:rPr>
-                <w:sz w:val="19"/>
-              </w:rPr>
-              <w:t>None (Static single-frame window)</w:t>
-            </w:r>
-          </w:p>
-        </w:tc>
-        <w:tc>
-          <w:tcPr>
-            <w:tcW w:type="dxa" w:w="3120"/>
-            <w:shd w:val="clear" w:color="auto" w:fill="FFFFFF"/>
-          </w:tcPr>
-          <w:p>
-            <w:r>
-              <w:rPr>
-                <w:sz w:val="19"/>
-              </w:rPr>
-              <w:t>Interactive 2D Pong with continuous keyboard polling, AI, and collision</w:t>
-            </w:r>
-          </w:p>
-        </w:tc>
-      </w:tr>
-      <w:tr>
-        <w:tc>
-          <w:tcPr>
-            <w:tcW w:type="dxa" w:w="3120"/>
-            <w:shd w:val="clear" w:color="auto" w:fill="F9FBFD"/>
-          </w:tcPr>
-          <w:p>
-            <w:r>
-              <w:rPr>
-                <w:b/>
-                <w:sz w:val="19"/>
-              </w:rPr>
-              <w:t>3D Capabilities</w:t>
-            </w:r>
-          </w:p>
-        </w:tc>
-        <w:tc>
-          <w:tcPr>
-            <w:tcW w:type="dxa" w:w="3120"/>
-            <w:shd w:val="clear" w:color="auto" w:fill="F9FBFD"/>
-          </w:tcPr>
-          <w:p>
-            <w:r>
-              <w:rPr>
-                <w:sz w:val="19"/>
-              </w:rPr>
-              <w:t>None (Strictly 2D)</w:t>
-            </w:r>
-          </w:p>
-        </w:tc>
-        <w:tc>
-          <w:tcPr>
-            <w:tcW w:type="dxa" w:w="3120"/>
-            <w:shd w:val="clear" w:color="auto" w:fill="F9FBFD"/>
-          </w:tcPr>
-          <w:p>
-            <w:r>
-              <w:rPr>
-                <w:sz w:val="19"/>
-              </w:rPr>
-              <w:t>3D First-Person POV World with depth buffer, camera lookAt, floor grid, 3D cubes, and collision sliding</w:t>
+              <w:t>Visibility: Public  |  Branch: main  |  Clone Command: git clone https://github.com/eldhoGI2/shader-compiler.git</w:t>
             </w:r>
           </w:p>
         </w:tc>
       </w:tr>
     </w:tbl>
-    <w:p>
-      <w:pPr>
-        <w:spacing w:after="160"/>
-      </w:pPr>
-    </w:p>
-    <w:p>
-      <w:pPr>
-        <w:pStyle w:val="Heading1"/>
-        <w:spacing w:before="320" w:after="120"/>
-      </w:pPr>
-      <w:r>
-        <w:rPr>
-          <w:rFonts w:ascii="Arial" w:hAnsi="Arial"/>
-          <w:b/>
-          <w:color w:val="0F3460"/>
-          <w:sz w:val="30"/>
-        </w:rPr>
-        <w:t>5. The 5 Demo Applications (How to Launch &amp; Inner Workings)</w:t>
-      </w:r>
-    </w:p>
-    <w:p>
-      <w:pPr>
-        <w:pStyle w:val="Heading2"/>
-        <w:spacing w:before="240" w:after="80"/>
-      </w:pPr>
-      <w:r>
-        <w:rPr>
-          <w:rFonts w:ascii="Arial" w:hAnsi="Arial"/>
-          <w:b/>
-          <w:color w:val="16213E"/>
-          <w:sz w:val="26"/>
-        </w:rPr>
-        <w:t>1. Original Baseline (demo.my)</w:t>
-      </w:r>
-    </w:p>
-    <w:p>
-      <w:r>
-        <w:rPr>
-          <w:b/>
-        </w:rPr>
-        <w:t xml:space="preserve">Launch Command: </w:t>
-      </w:r>
-      <w:r>
-        <w:rPr>
-          <w:rFonts w:ascii="Consolas" w:hAnsi="Consolas"/>
-        </w:rPr>
-        <w:t>./mycompiler demo.my &amp;&amp; ./final_game</w:t>
-      </w:r>
-    </w:p>
-    <w:p>
-      <w:r>
-        <w:t>The baseline test script from Review 1. It verifies that simple procedural 2D commands (window, color, center_rect, circle, triangle, line) continue to compile and render flawlessly under the new hardware-accelerated OpenGL 2 pipeline.</w:t>
-      </w:r>
-    </w:p>
-    <w:p>
-      <w:pPr>
-        <w:pStyle w:val="Heading2"/>
-        <w:spacing w:before="240" w:after="80"/>
-      </w:pPr>
-      <w:r>
-        <w:rPr>
-          <w:rFonts w:ascii="Arial" w:hAnsi="Arial"/>
-          <w:b/>
-          <w:color w:val="16213E"/>
-          <w:sz w:val="26"/>
-        </w:rPr>
-        <w:t>2. Geometric Shapes &amp; Colors Showcase (showcase.my)</w:t>
-      </w:r>
-    </w:p>
-    <w:p>
-      <w:r>
-        <w:rPr>
-          <w:b/>
-        </w:rPr>
-        <w:t xml:space="preserve">Launch Command: </w:t>
-      </w:r>
-      <w:r>
-        <w:rPr>
-          <w:rFonts w:ascii="Consolas" w:hAnsi="Consolas"/>
-        </w:rPr>
-        <w:t>./mycompiler showcase.my &amp;&amp; ./final_game</w:t>
-      </w:r>
-    </w:p>
-    <w:p>
-      <w:r>
-        <w:t>Demonstrates the expanded 2D vector geometry library. It renders an animated cyberpunk matrix shader behind translucent rounded cards, draws a gold 5-point star, a regular hexagon (6-sided polygon), filled and outlined ellipses, custom stroke widths (line_width 3), and point dots (point_size 8).</w:t>
-      </w:r>
-    </w:p>
-    <w:p>
-      <w:pPr>
-        <w:pStyle w:val="Heading2"/>
-        <w:spacing w:before="240" w:after="80"/>
-      </w:pPr>
-      <w:r>
-        <w:rPr>
-          <w:rFonts w:ascii="Arial" w:hAnsi="Arial"/>
-          <w:b/>
-          <w:color w:val="16213E"/>
-          <w:sz w:val="26"/>
-        </w:rPr>
-        <w:t>3. Cyberpunk Shaders &amp; Gradients (cyberpunk.my)</w:t>
-      </w:r>
-    </w:p>
-    <w:p>
-      <w:r>
-        <w:rPr>
-          <w:b/>
-        </w:rPr>
-        <w:t xml:space="preserve">Launch Command: </w:t>
-      </w:r>
-      <w:r>
-        <w:rPr>
-          <w:rFonts w:ascii="Consolas" w:hAnsi="Consolas"/>
-        </w:rPr>
-        <w:t>./mycompiler cyberpunk.my &amp;&amp; ./final_game</w:t>
-      </w:r>
-    </w:p>
-    <w:p>
-      <w:r>
-        <w:t>Demonstrates advanced visual effects. It compiles an external GLSL fragment shader (plasma.frag), renders multi-stop vertical and horizontal color gradients (gradient_rect, gradient_h_rect), renders a classic 3-color interpolated OpenGL triangle (gradient_triangle), and uses matrix stacks (push, translate, rotate 45, pop) to draw rotated geometry.</w:t>
-      </w:r>
-    </w:p>
-    <w:p>
-      <w:pPr>
-        <w:pStyle w:val="Heading2"/>
-        <w:spacing w:before="240" w:after="80"/>
-      </w:pPr>
-      <w:r>
-        <w:rPr>
-          <w:rFonts w:ascii="Arial" w:hAnsi="Arial"/>
-          <w:b/>
-          <w:color w:val="16213E"/>
-          <w:sz w:val="26"/>
-        </w:rPr>
-        <w:t>4. Interactive 2D Pong Game (pong.my)</w:t>
-      </w:r>
-    </w:p>
-    <w:p>
-      <w:r>
-        <w:rPr>
-          <w:b/>
-        </w:rPr>
-        <w:t xml:space="preserve">Launch Command: </w:t>
-      </w:r>
-      <w:r>
-        <w:rPr>
-          <w:rFonts w:ascii="Consolas" w:hAnsi="Consolas"/>
-        </w:rPr>
-        <w:t>./mycompiler pong.my &amp;&amp; ./final_game</w:t>
-      </w:r>
-    </w:p>
-    <w:p>
-      <w:r>
-        <w:t>Controls: [W]/[S] or [Up]/[Down] to move paddle, [SPACE] to cycle live shaders, [R] to reset score, [ESC] to exit.</w:t>
-        <w:br/>
-        <w:br/>
-        <w:t>Inner Working: The compiler detects the 'pong' keyword and invokes run_pong_game(). The engine polls keyboard state at 60 FPS, updates ball velocity vectors, implements a smooth AI paddle that tracks ball Y-coordinates, calculates Axis-Aligned Bounding Box (AABB) collisions with angle deflection, and draws a real-time 7-segment digital scoreboard using quads with zero external font dependencies.</w:t>
-      </w:r>
-    </w:p>
-    <w:p>
-      <w:pPr>
-        <w:pStyle w:val="Heading2"/>
-        <w:spacing w:before="240" w:after="80"/>
-      </w:pPr>
-      <w:r>
-        <w:rPr>
-          <w:rFonts w:ascii="Arial" w:hAnsi="Arial"/>
-          <w:b/>
-          <w:color w:val="16213E"/>
-          <w:sz w:val="26"/>
-        </w:rPr>
-        <w:t>5. 3D First-Person POV World Explorer (world3d.my)</w:t>
-      </w:r>
-    </w:p>
-    <w:p>
-      <w:r>
-        <w:rPr>
-          <w:b/>
-        </w:rPr>
-        <w:t xml:space="preserve">Launch Command: </w:t>
-      </w:r>
-      <w:r>
-        <w:rPr>
-          <w:rFonts w:ascii="Consolas" w:hAnsi="Consolas"/>
-        </w:rPr>
-        <w:t>./mycompiler world3d.my &amp;&amp; ./final_game</w:t>
-      </w:r>
-    </w:p>
-    <w:p>
-      <w:r>
-        <w:t>Controls: [W]/[S] to walk forward/back, [A]/[D] to strafe, Mouse or [Left]/[Right] arrows to look in 360°, [M] to toggle mouse grab, [SPACE] to cycle lighting shaders, [ESC] to exit.</w:t>
-        <w:br/>
-        <w:br/>
-        <w:t>Inner Working: The compiler detects 'mode_3d' and calls run_3d_game(). It enables hardware 3D depth-buffering (glEnable(GL_DEPTH_TEST)), configures perspective projection (gluPerspective), places a first-person camera at 1.6m eye level (gluLookAt), generates a 40-unit checkerboard floor, builds 4 boundary walls, renders directional-shaded 3D cubes with wireframe edges, floats a rotating gold crystal in the center, and executes wall-sliding collision physics.</w:t>
-      </w:r>
-    </w:p>
-    <w:p>
-      <w:pPr>
-        <w:pStyle w:val="Heading1"/>
-        <w:spacing w:before="320" w:after="120"/>
-      </w:pPr>
-      <w:r>
-        <w:rPr>
-          <w:rFonts w:ascii="Arial" w:hAnsi="Arial"/>
-          <w:b/>
-          <w:color w:val="0F3460"/>
-          <w:sz w:val="30"/>
-        </w:rPr>
-        <w:t>6. Complete DSL Language &amp; Syntax Specification</w:t>
-      </w:r>
-    </w:p>
-    <w:p>
-      <w:r>
-        <w:t>The language uses a clean, whitespace-delimited, declarative syntax. Below is the master reference table:</w:t>
-      </w:r>
-    </w:p>
-    <w:tbl>
-      <w:tblPr>
-        <w:tblW w:type="auto" w:w="0"/>
-        <w:jc w:val="center"/>
-        <w:tblLook w:firstColumn="1" w:firstRow="1" w:lastColumn="0" w:lastRow="0" w:noHBand="0" w:noVBand="1" w:val="04A0"/>
-      </w:tblPr>
-      <w:tblGrid>
-        <w:gridCol w:w="3120"/>
-        <w:gridCol w:w="3120"/>
-        <w:gridCol w:w="3120"/>
-      </w:tblGrid>
-      <w:tr>
-        <w:tc>
-          <w:tcPr>
-            <w:tcW w:type="dxa" w:w="3120"/>
-            <w:shd w:val="clear" w:color="auto" w:fill="0F3460"/>
-          </w:tcPr>
-          <w:p>
-            <w:r>
-              <w:rPr>
-                <w:b/>
-                <w:color w:val="FFFFFF"/>
-              </w:rPr>
-              <w:t>Command Category</w:t>
-            </w:r>
-          </w:p>
-        </w:tc>
-        <w:tc>
-          <w:tcPr>
-            <w:tcW w:type="dxa" w:w="3120"/>
-            <w:shd w:val="clear" w:color="auto" w:fill="0F3460"/>
-          </w:tcPr>
-          <w:p>
-            <w:r>
-              <w:rPr>
-                <w:b/>
-                <w:color w:val="FFFFFF"/>
-              </w:rPr>
-              <w:t>DSL Syntax Example</w:t>
-            </w:r>
-          </w:p>
-        </w:tc>
-        <w:tc>
-          <w:tcPr>
-            <w:tcW w:type="dxa" w:w="3120"/>
-            <w:shd w:val="clear" w:color="auto" w:fill="0F3460"/>
-          </w:tcPr>
-          <w:p>
-            <w:r>
-              <w:rPr>
-                <w:b/>
-                <w:color w:val="FFFFFF"/>
-              </w:rPr>
-              <w:t>Technical Description</w:t>
-            </w:r>
-          </w:p>
-        </w:tc>
-      </w:tr>
-      <w:tr>
-        <w:tc>
-          <w:tcPr>
-            <w:tcW w:type="dxa" w:w="3120"/>
-            <w:shd w:val="clear" w:color="auto" w:fill="F9FBFD"/>
-          </w:tcPr>
-          <w:p>
-            <w:r>
-              <w:rPr>
-                <w:b/>
-                <w:sz w:val="18"/>
-              </w:rPr>
-              <w:t>Window Setup</w:t>
-            </w:r>
-          </w:p>
-        </w:tc>
-        <w:tc>
-          <w:tcPr>
-            <w:tcW w:type="dxa" w:w="3120"/>
-            <w:shd w:val="clear" w:color="auto" w:fill="F9FBFD"/>
-          </w:tcPr>
-          <w:p>
-            <w:r>
-              <w:rPr>
-                <w:rFonts w:ascii="Consolas" w:hAnsi="Consolas"/>
-                <w:sz w:val="18"/>
-              </w:rPr>
-              <w:t>window 900 700</w:t>
-            </w:r>
-          </w:p>
-        </w:tc>
-        <w:tc>
-          <w:tcPr>
-            <w:tcW w:type="dxa" w:w="3120"/>
-            <w:shd w:val="clear" w:color="auto" w:fill="F9FBFD"/>
-          </w:tcPr>
-          <w:p>
-            <w:r>
-              <w:rPr>
-                <w:sz w:val="18"/>
-              </w:rPr>
-              <w:t>Sets canvas width and height in pixels</w:t>
-            </w:r>
-          </w:p>
-        </w:tc>
-      </w:tr>
-      <w:tr>
-        <w:tc>
-          <w:tcPr>
-            <w:tcW w:type="dxa" w:w="3120"/>
-            <w:shd w:val="clear" w:color="auto" w:fill="FFFFFF"/>
-          </w:tcPr>
-          <w:p>
-            <w:r>
-              <w:rPr>
-                <w:b/>
-                <w:sz w:val="18"/>
-              </w:rPr>
-              <w:t>Window Title</w:t>
-            </w:r>
-          </w:p>
-        </w:tc>
-        <w:tc>
-          <w:tcPr>
-            <w:tcW w:type="dxa" w:w="3120"/>
-            <w:shd w:val="clear" w:color="auto" w:fill="FFFFFF"/>
-          </w:tcPr>
-          <w:p>
-            <w:r>
-              <w:rPr>
-                <w:rFonts w:ascii="Consolas" w:hAnsi="Consolas"/>
-                <w:sz w:val="18"/>
-              </w:rPr>
-              <w:t>title "Cyberpunk World"</w:t>
-            </w:r>
-          </w:p>
-        </w:tc>
-        <w:tc>
-          <w:tcPr>
-            <w:tcW w:type="dxa" w:w="3120"/>
-            <w:shd w:val="clear" w:color="auto" w:fill="FFFFFF"/>
-          </w:tcPr>
-          <w:p>
-            <w:r>
-              <w:rPr>
-                <w:sz w:val="18"/>
-              </w:rPr>
-              <w:t>Sets the operating system window header text</w:t>
-            </w:r>
-          </w:p>
-        </w:tc>
-      </w:tr>
-      <w:tr>
-        <w:tc>
-          <w:tcPr>
-            <w:tcW w:type="dxa" w:w="3120"/>
-            <w:shd w:val="clear" w:color="auto" w:fill="F9FBFD"/>
-          </w:tcPr>
-          <w:p>
-            <w:r>
-              <w:rPr>
-                <w:b/>
-                <w:sz w:val="18"/>
-              </w:rPr>
-              <w:t>Background Clear</w:t>
-            </w:r>
-          </w:p>
-        </w:tc>
-        <w:tc>
-          <w:tcPr>
-            <w:tcW w:type="dxa" w:w="3120"/>
-            <w:shd w:val="clear" w:color="auto" w:fill="F9FBFD"/>
-          </w:tcPr>
-          <w:p>
-            <w:r>
-              <w:rPr>
-                <w:rFonts w:ascii="Consolas" w:hAnsi="Consolas"/>
-                <w:sz w:val="18"/>
-              </w:rPr>
-              <w:t>bg #0f172a  or  bg navy</w:t>
-            </w:r>
-          </w:p>
-        </w:tc>
-        <w:tc>
-          <w:tcPr>
-            <w:tcW w:type="dxa" w:w="3120"/>
-            <w:shd w:val="clear" w:color="auto" w:fill="F9FBFD"/>
-          </w:tcPr>
-          <w:p>
-            <w:r>
-              <w:rPr>
-                <w:sz w:val="18"/>
-              </w:rPr>
-              <w:t>Sets the background clear color via glClearColor</w:t>
-            </w:r>
-          </w:p>
-        </w:tc>
-      </w:tr>
-      <w:tr>
-        <w:tc>
-          <w:tcPr>
-            <w:tcW w:type="dxa" w:w="3120"/>
-            <w:shd w:val="clear" w:color="auto" w:fill="FFFFFF"/>
-          </w:tcPr>
-          <w:p>
-            <w:r>
-              <w:rPr>
-                <w:b/>
-                <w:sz w:val="18"/>
-              </w:rPr>
-              <w:t>GPU Shaders</w:t>
-            </w:r>
-          </w:p>
-        </w:tc>
-        <w:tc>
-          <w:tcPr>
-            <w:tcW w:type="dxa" w:w="3120"/>
-            <w:shd w:val="clear" w:color="auto" w:fill="FFFFFF"/>
-          </w:tcPr>
-          <w:p>
-            <w:r>
-              <w:rPr>
-                <w:rFonts w:ascii="Consolas" w:hAnsi="Consolas"/>
-                <w:sz w:val="18"/>
-              </w:rPr>
-              <w:t>shader grid  or  shader rainbow</w:t>
-            </w:r>
-          </w:p>
-        </w:tc>
-        <w:tc>
-          <w:tcPr>
-            <w:tcW w:type="dxa" w:w="3120"/>
-            <w:shd w:val="clear" w:color="auto" w:fill="FFFFFF"/>
-          </w:tcPr>
-          <w:p>
-            <w:r>
-              <w:rPr>
-                <w:sz w:val="18"/>
-              </w:rPr>
-              <w:t>Activates live animated GLSL 1.20 fragment shaders</w:t>
-            </w:r>
-          </w:p>
-        </w:tc>
-      </w:tr>
-      <w:tr>
-        <w:tc>
-          <w:tcPr>
-            <w:tcW w:type="dxa" w:w="3120"/>
-            <w:shd w:val="clear" w:color="auto" w:fill="F9FBFD"/>
-          </w:tcPr>
-          <w:p>
-            <w:r>
-              <w:rPr>
-                <w:b/>
-                <w:sz w:val="18"/>
-              </w:rPr>
-              <w:t>Custom Shader</w:t>
-            </w:r>
-          </w:p>
-        </w:tc>
-        <w:tc>
-          <w:tcPr>
-            <w:tcW w:type="dxa" w:w="3120"/>
-            <w:shd w:val="clear" w:color="auto" w:fill="F9FBFD"/>
-          </w:tcPr>
-          <w:p>
-            <w:r>
-              <w:rPr>
-                <w:rFonts w:ascii="Consolas" w:hAnsi="Consolas"/>
-                <w:sz w:val="18"/>
-              </w:rPr>
-              <w:t>custom_shader plasma.frag</w:t>
-            </w:r>
-          </w:p>
-        </w:tc>
-        <w:tc>
-          <w:tcPr>
-            <w:tcW w:type="dxa" w:w="3120"/>
-            <w:shd w:val="clear" w:color="auto" w:fill="F9FBFD"/>
-          </w:tcPr>
-          <w:p>
-            <w:r>
-              <w:rPr>
-                <w:sz w:val="18"/>
-              </w:rPr>
-              <w:t>Loads, compiles, and links an external GLSL shader file</w:t>
-            </w:r>
-          </w:p>
-        </w:tc>
-      </w:tr>
-      <w:tr>
-        <w:tc>
-          <w:tcPr>
-            <w:tcW w:type="dxa" w:w="3120"/>
-            <w:shd w:val="clear" w:color="auto" w:fill="FFFFFF"/>
-          </w:tcPr>
-          <w:p>
-            <w:r>
-              <w:rPr>
-                <w:b/>
-                <w:sz w:val="18"/>
-              </w:rPr>
-              <w:t>3D Environment</w:t>
-            </w:r>
-          </w:p>
-        </w:tc>
-        <w:tc>
-          <w:tcPr>
-            <w:tcW w:type="dxa" w:w="3120"/>
-            <w:shd w:val="clear" w:color="auto" w:fill="FFFFFF"/>
-          </w:tcPr>
-          <w:p>
-            <w:r>
-              <w:rPr>
-                <w:rFonts w:ascii="Consolas" w:hAnsi="Consolas"/>
-                <w:sz w:val="18"/>
-              </w:rPr>
-              <w:t>mode_3d</w:t>
-              <w:br/>
-              <w:t>floor 40 #161a2e #0e1224</w:t>
-              <w:br/>
-              <w:t>walls 40 5 #0f3460</w:t>
-            </w:r>
-          </w:p>
-        </w:tc>
-        <w:tc>
-          <w:tcPr>
-            <w:tcW w:type="dxa" w:w="3120"/>
-            <w:shd w:val="clear" w:color="auto" w:fill="FFFFFF"/>
-          </w:tcPr>
-          <w:p>
-            <w:r>
-              <w:rPr>
-                <w:sz w:val="18"/>
-              </w:rPr>
-              <w:t>Activates 3D first-person mode with tiled floor and perimeter walls</w:t>
-            </w:r>
-          </w:p>
-        </w:tc>
-      </w:tr>
-      <w:tr>
-        <w:tc>
-          <w:tcPr>
-            <w:tcW w:type="dxa" w:w="3120"/>
-            <w:shd w:val="clear" w:color="auto" w:fill="F9FBFD"/>
-          </w:tcPr>
-          <w:p>
-            <w:r>
-              <w:rPr>
-                <w:b/>
-                <w:sz w:val="18"/>
-              </w:rPr>
-              <w:t>3D Objects</w:t>
-            </w:r>
-          </w:p>
-        </w:tc>
-        <w:tc>
-          <w:tcPr>
-            <w:tcW w:type="dxa" w:w="3120"/>
-            <w:shd w:val="clear" w:color="auto" w:fill="F9FBFD"/>
-          </w:tcPr>
-          <w:p>
-            <w:r>
-              <w:rPr>
-                <w:rFonts w:ascii="Consolas" w:hAnsi="Consolas"/>
-                <w:sz w:val="18"/>
-              </w:rPr>
-              <w:t>cube 0 1 -10 2 gold</w:t>
-              <w:br/>
-              <w:t>pillar -12 0 2 5 #e94560</w:t>
-            </w:r>
-          </w:p>
-        </w:tc>
-        <w:tc>
-          <w:tcPr>
-            <w:tcW w:type="dxa" w:w="3120"/>
-            <w:shd w:val="clear" w:color="auto" w:fill="F9FBFD"/>
-          </w:tcPr>
-          <w:p>
-            <w:r>
-              <w:rPr>
-                <w:sz w:val="18"/>
-              </w:rPr>
-              <w:t>Places solid 3D cubes and pillars with active collision detection</w:t>
-            </w:r>
-          </w:p>
-        </w:tc>
-      </w:tr>
-      <w:tr>
-        <w:tc>
-          <w:tcPr>
-            <w:tcW w:type="dxa" w:w="3120"/>
-            <w:shd w:val="clear" w:color="auto" w:fill="FFFFFF"/>
-          </w:tcPr>
-          <w:p>
-            <w:r>
-              <w:rPr>
-                <w:b/>
-                <w:sz w:val="18"/>
-              </w:rPr>
-              <w:t>2D Pong Game</w:t>
-            </w:r>
-          </w:p>
-        </w:tc>
-        <w:tc>
-          <w:tcPr>
-            <w:tcW w:type="dxa" w:w="3120"/>
-            <w:shd w:val="clear" w:color="auto" w:fill="FFFFFF"/>
-          </w:tcPr>
-          <w:p>
-            <w:r>
-              <w:rPr>
-                <w:rFonts w:ascii="Consolas" w:hAnsi="Consolas"/>
-                <w:sz w:val="18"/>
-              </w:rPr>
-              <w:t>pong</w:t>
-              <w:br/>
-              <w:t>paddle cyan</w:t>
-              <w:br/>
-              <w:t>ai_paddle magenta</w:t>
-              <w:br/>
-              <w:t>ball gold</w:t>
-            </w:r>
-          </w:p>
-        </w:tc>
-        <w:tc>
-          <w:tcPr>
-            <w:tcW w:type="dxa" w:w="3120"/>
-            <w:shd w:val="clear" w:color="auto" w:fill="FFFFFF"/>
-          </w:tcPr>
-          <w:p>
-            <w:r>
-              <w:rPr>
-                <w:sz w:val="18"/>
-              </w:rPr>
-              <w:t>Activates interactive 2D Pong game with AI, ball physics, and scoreboard</w:t>
-            </w:r>
-          </w:p>
-        </w:tc>
-      </w:tr>
-      <w:tr>
-        <w:tc>
-          <w:tcPr>
-            <w:tcW w:type="dxa" w:w="3120"/>
-            <w:shd w:val="clear" w:color="auto" w:fill="F9FBFD"/>
-          </w:tcPr>
-          <w:p>
-            <w:r>
-              <w:rPr>
-                <w:b/>
-                <w:sz w:val="18"/>
-              </w:rPr>
-              <w:t>Color Definition</w:t>
-            </w:r>
-          </w:p>
-        </w:tc>
-        <w:tc>
-          <w:tcPr>
-            <w:tcW w:type="dxa" w:w="3120"/>
-            <w:shd w:val="clear" w:color="auto" w:fill="F9FBFD"/>
-          </w:tcPr>
-          <w:p>
-            <w:r>
-              <w:rPr>
-                <w:rFonts w:ascii="Consolas" w:hAnsi="Consolas"/>
-                <w:sz w:val="18"/>
-              </w:rPr>
-              <w:t>color red  or  color #ff007f</w:t>
-              <w:br/>
-              <w:t>color 255 128 0 180</w:t>
-            </w:r>
-          </w:p>
-        </w:tc>
-        <w:tc>
-          <w:tcPr>
-            <w:tcW w:type="dxa" w:w="3120"/>
-            <w:shd w:val="clear" w:color="auto" w:fill="F9FBFD"/>
-          </w:tcPr>
-          <w:p>
-            <w:r>
-              <w:rPr>
-                <w:sz w:val="18"/>
-              </w:rPr>
-              <w:t>Sets active rendering color using names, hex, or RGBA numbers</w:t>
-            </w:r>
-          </w:p>
-        </w:tc>
-      </w:tr>
-      <w:tr>
-        <w:tc>
-          <w:tcPr>
-            <w:tcW w:type="dxa" w:w="3120"/>
-            <w:shd w:val="clear" w:color="auto" w:fill="FFFFFF"/>
-          </w:tcPr>
-          <w:p>
-            <w:r>
-              <w:rPr>
-                <w:b/>
-                <w:sz w:val="18"/>
-              </w:rPr>
-              <w:t>Color Gradients</w:t>
-            </w:r>
-          </w:p>
-        </w:tc>
-        <w:tc>
-          <w:tcPr>
-            <w:tcW w:type="dxa" w:w="3120"/>
-            <w:shd w:val="clear" w:color="auto" w:fill="FFFFFF"/>
-          </w:tcPr>
-          <w:p>
-            <w:r>
-              <w:rPr>
-                <w:rFonts w:ascii="Consolas" w:hAnsi="Consolas"/>
-                <w:sz w:val="18"/>
-              </w:rPr>
-              <w:t>gradient_rect 50 50 800 250 cyan magenta</w:t>
-              <w:br/>
-              <w:t>gradient_triangle x1 y1 c1 x2 y2 c2 x3 y3 c3</w:t>
-            </w:r>
-          </w:p>
-        </w:tc>
-        <w:tc>
-          <w:tcPr>
-            <w:tcW w:type="dxa" w:w="3120"/>
-            <w:shd w:val="clear" w:color="auto" w:fill="FFFFFF"/>
-          </w:tcPr>
-          <w:p>
-            <w:r>
-              <w:rPr>
-                <w:sz w:val="18"/>
-              </w:rPr>
-              <w:t>Draws smooth multi-color interpolated gradient shapes</w:t>
-            </w:r>
-          </w:p>
-        </w:tc>
-      </w:tr>
-      <w:tr>
-        <w:tc>
-          <w:tcPr>
-            <w:tcW w:type="dxa" w:w="3120"/>
-            <w:shd w:val="clear" w:color="auto" w:fill="F9FBFD"/>
-          </w:tcPr>
-          <w:p>
-            <w:r>
-              <w:rPr>
-                <w:b/>
-                <w:sz w:val="18"/>
-              </w:rPr>
-              <w:t>Matrix Transforms</w:t>
-            </w:r>
-          </w:p>
-        </w:tc>
-        <w:tc>
-          <w:tcPr>
-            <w:tcW w:type="dxa" w:w="3120"/>
-            <w:shd w:val="clear" w:color="auto" w:fill="F9FBFD"/>
-          </w:tcPr>
-          <w:p>
-            <w:r>
-              <w:rPr>
-                <w:rFonts w:ascii="Consolas" w:hAnsi="Consolas"/>
-                <w:sz w:val="18"/>
-              </w:rPr>
-              <w:t>rotate 45</w:t>
-              <w:br/>
-              <w:t>translate 100 200</w:t>
-              <w:br/>
-              <w:t>push / pop</w:t>
-            </w:r>
-          </w:p>
-        </w:tc>
-        <w:tc>
-          <w:tcPr>
-            <w:tcW w:type="dxa" w:w="3120"/>
-            <w:shd w:val="clear" w:color="auto" w:fill="F9FBFD"/>
-          </w:tcPr>
-          <w:p>
-            <w:r>
-              <w:rPr>
-                <w:sz w:val="18"/>
-              </w:rPr>
-              <w:t>Rotates, moves, scales, and isolates coordinate matrices in OpenGL</w:t>
-            </w:r>
-          </w:p>
-        </w:tc>
-      </w:tr>
-      <w:tr>
-        <w:tc>
-          <w:tcPr>
-            <w:tcW w:type="dxa" w:w="3120"/>
-            <w:shd w:val="clear" w:color="auto" w:fill="FFFFFF"/>
-          </w:tcPr>
-          <w:p>
-            <w:r>
-              <w:rPr>
-                <w:b/>
-                <w:sz w:val="18"/>
-              </w:rPr>
-              <w:t>Rectangles &amp; Squares</w:t>
-            </w:r>
-          </w:p>
-        </w:tc>
-        <w:tc>
-          <w:tcPr>
-            <w:tcW w:type="dxa" w:w="3120"/>
-            <w:shd w:val="clear" w:color="auto" w:fill="FFFFFF"/>
-          </w:tcPr>
-          <w:p>
-            <w:r>
-              <w:rPr>
-                <w:rFonts w:ascii="Consolas" w:hAnsi="Consolas"/>
-                <w:sz w:val="18"/>
-              </w:rPr>
-              <w:t>rect x y w h  or  square x y size</w:t>
-              <w:br/>
-              <w:t>rounded_rect x y w h radius</w:t>
-            </w:r>
-          </w:p>
-        </w:tc>
-        <w:tc>
-          <w:tcPr>
-            <w:tcW w:type="dxa" w:w="3120"/>
-            <w:shd w:val="clear" w:color="auto" w:fill="FFFFFF"/>
-          </w:tcPr>
-          <w:p>
-            <w:r>
-              <w:rPr>
-                <w:sz w:val="18"/>
-              </w:rPr>
-              <w:t>Renders filled, outlined, centered, or rounded rectangles</w:t>
-            </w:r>
-          </w:p>
-        </w:tc>
-      </w:tr>
-      <w:tr>
-        <w:tc>
-          <w:tcPr>
-            <w:tcW w:type="dxa" w:w="3120"/>
-            <w:shd w:val="clear" w:color="auto" w:fill="F9FBFD"/>
-          </w:tcPr>
-          <w:p>
-            <w:r>
-              <w:rPr>
-                <w:b/>
-                <w:sz w:val="18"/>
-              </w:rPr>
-              <w:t>Circles &amp; Stars</w:t>
-            </w:r>
-          </w:p>
-        </w:tc>
-        <w:tc>
-          <w:tcPr>
-            <w:tcW w:type="dxa" w:w="3120"/>
-            <w:shd w:val="clear" w:color="auto" w:fill="F9FBFD"/>
-          </w:tcPr>
-          <w:p>
-            <w:r>
-              <w:rPr>
-                <w:rFonts w:ascii="Consolas" w:hAnsi="Consolas"/>
-                <w:sz w:val="18"/>
-              </w:rPr>
-              <w:t>circle cx cy r  or  fill_circle cx cy r</w:t>
-              <w:br/>
-              <w:t>star cx cy outer_r inner_r points</w:t>
-            </w:r>
-          </w:p>
-        </w:tc>
-        <w:tc>
-          <w:tcPr>
-            <w:tcW w:type="dxa" w:w="3120"/>
-            <w:shd w:val="clear" w:color="auto" w:fill="F9FBFD"/>
-          </w:tcPr>
-          <w:p>
-            <w:r>
-              <w:rPr>
-                <w:sz w:val="18"/>
-              </w:rPr>
-              <w:t>Renders outline/filled circles, ellipses, regular polygons, and stars</w:t>
-            </w:r>
-          </w:p>
-        </w:tc>
-      </w:tr>
-    </w:tbl>
-    <w:p>
-      <w:pPr>
-        <w:spacing w:after="160"/>
-      </w:pPr>
-    </w:p>
-    <w:p>
-      <w:pPr>
-        <w:pStyle w:val="Heading1"/>
-        <w:spacing w:before="320" w:after="120"/>
-      </w:pPr>
-      <w:r>
-        <w:rPr>
-          <w:rFonts w:ascii="Arial" w:hAnsi="Arial"/>
-          <w:b/>
-          <w:color w:val="0F3460"/>
-          <w:sz w:val="30"/>
-        </w:rPr>
-        <w:t>7. Mathematical &amp; Algorithmic Foundations</w:t>
-      </w:r>
-    </w:p>
-    <w:p>
-      <w:r>
-        <w:t>Below are the primary mathematical formulas and computer science algorithms implemented across the compiler and runtime engine:</w:t>
-      </w:r>
-    </w:p>
-    <w:p>
-      <w:pPr>
-        <w:pStyle w:val="Heading2"/>
-        <w:spacing w:before="240" w:after="80"/>
-      </w:pPr>
-      <w:r>
-        <w:rPr>
-          <w:rFonts w:ascii="Arial" w:hAnsi="Arial"/>
-          <w:b/>
-          <w:color w:val="16213E"/>
-          <w:sz w:val="26"/>
-        </w:rPr>
-        <w:t>A. 2D Pong Collision Detection (Axis-Aligned Bounding Box vs. Circle)</w:t>
-      </w:r>
-    </w:p>
-    <w:p>
-      <w:r>
-        <w:t>The Pong collision engine checks for intersection between a circle of radius r at position (bx, by) and an AABB bounding box at (px, py) with width w and height h:</w:t>
-        <w:br/>
-        <w:br/>
-        <w:t>1. Horizontal Collision Condition:</w:t>
-        <w:br/>
-        <w:t xml:space="preserve">   (bx - r &lt;= px + w) AND (bx + r &gt;= px)</w:t>
-        <w:br/>
-        <w:br/>
-        <w:t>2. Vertical Collision Condition:</w:t>
-        <w:br/>
-        <w:t xml:space="preserve">   (by &gt;= py - r) AND (by &lt;= py + h + r)</w:t>
-        <w:br/>
-        <w:br/>
-        <w:t>3. Variable Angle Deflection:</w:t>
-        <w:br/>
-        <w:t xml:space="preserve">   When collision occurs, the horizontal velocity is inverted and accelerated: vx = -vx * 1.05</w:t>
-        <w:br/>
-        <w:t xml:space="preserve">   The vertical velocity is computed based on distance from the paddle's midpoint:</w:t>
-        <w:br/>
-        <w:t xml:space="preserve">   offset = (by - (py + h / 2.0)) / (h / 2.0)</w:t>
-        <w:br/>
-        <w:t xml:space="preserve">   vy = offset * 6.5</w:t>
-      </w:r>
-    </w:p>
-    <w:p>
-      <w:pPr>
-        <w:pStyle w:val="Heading2"/>
-        <w:spacing w:before="240" w:after="80"/>
-      </w:pPr>
-      <w:r>
-        <w:rPr>
-          <w:rFonts w:ascii="Arial" w:hAnsi="Arial"/>
-          <w:b/>
-          <w:color w:val="16213E"/>
-          <w:sz w:val="26"/>
-        </w:rPr>
-        <w:t>B. 3D First-Person Camera Mathematics &amp; Wall Sliding</w:t>
-      </w:r>
-    </w:p>
-    <w:p>
-      <w:r>
-        <w:t>The first-person camera uses spherical trigonometry to compute the forward and right motion vectors along the X-Z ground plane:</w:t>
-        <w:br/>
-        <w:br/>
-        <w:t>• Forward Vector: fwd_x = sin(yaw), fwd_z = -cos(yaw)</w:t>
-        <w:br/>
-        <w:t>• Right Vector: right_x = cos(yaw), right_z = sin(yaw)</w:t>
-        <w:br/>
-        <w:t>• Look Target: target_x = cam_x + cos(pitch) * sin(yaw), target_y = cam_y + sin(pitch), target_z = cam_z - cos(pitch) * cos(yaw)</w:t>
-        <w:br/>
-        <w:br/>
-        <w:t>Wall Sliding Collision:</w:t>
-        <w:br/>
-        <w:t>Candidate coordinates (next_x, next_z) are evaluated independently against obstacle bounding boxes. If next_x breaches an obstacle boundary along the X-axis, next_x is clamped to the obstacle surface while next_z remains free to update, enabling the player to smoothly slide along walls rather than stopping abruptly.</w:t>
-      </w:r>
-    </w:p>
-    <w:p>
-      <w:pPr>
-        <w:pStyle w:val="Heading2"/>
-        <w:spacing w:before="240" w:after="80"/>
-      </w:pPr>
-      <w:r>
-        <w:rPr>
-          <w:rFonts w:ascii="Arial" w:hAnsi="Arial"/>
-          <w:b/>
-          <w:color w:val="16213E"/>
-          <w:sz w:val="26"/>
-        </w:rPr>
-        <w:t>C. 7-Segment Digital Arcade Display Algorithm</w:t>
-      </w:r>
-    </w:p>
-    <w:p>
-      <w:r>
-        <w:t>To render real-time scores without external font dependencies (such as SDL_ttf or .ttf font files), the runtime implements an electronic 7-segment LED display using bitmasks:</w:t>
-        <w:br/>
-        <w:t>• DIGITS[10] = {0x3F, 0x06, 0x5B, 0x4F, 0x66, 0x6D, 0x7D, 0x07, 0x7F, 0x6F}</w:t>
-        <w:br/>
-        <w:t>Each bit corresponds to one of the 7 segments (Top, Top-Right, Bottom-Right, Bottom, Bottom-Left, Top-Left, Middle). When rendering, the function draws quad primitives for each active bit in the mask.</w:t>
-      </w:r>
-    </w:p>
-    <w:p>
-      <w:pPr>
-        <w:pStyle w:val="Heading1"/>
-        <w:spacing w:before="320" w:after="120"/>
-      </w:pPr>
-      <w:r>
-        <w:rPr>
-          <w:rFonts w:ascii="Arial" w:hAnsi="Arial"/>
-          <w:b/>
-          <w:color w:val="0F3460"/>
-          <w:sz w:val="30"/>
-        </w:rPr>
-        <w:t>8. University Review &amp; Viva Presentation Guide</w:t>
-      </w:r>
-    </w:p>
-    <w:p>
-      <w:r>
-        <w:t>Here are the most common questions professors ask during compiler design and graphics reviews, along with the recommended answers:</w:t>
-      </w:r>
-    </w:p>
-    <w:p>
-      <w:r>
-        <w:rPr>
-          <w:b/>
-          <w:color w:val="0F3460"/>
-        </w:rPr>
-        <w:t>Q1: Is this an actual GPU shader compiler?</w:t>
-      </w:r>
-    </w:p>
-    <w:p>
-      <w:pPr>
-        <w:spacing w:after="120"/>
-      </w:pPr>
-      <w:r>
-        <w:t>Answer: No. While the original folder was named 'shadercompailer', this project is a high-level Domain-Specific Language (DSL) and Source-to-Source Compiler (Transpiler). It translates human-readable .my scripts into standard C code, which is then compiled into a native OpenGL 2.1 application. It also features a real hardware GLSL fragment shader pipeline on the GPU.</w:t>
-      </w:r>
-    </w:p>
-    <w:p>
-      <w:r>
-        <w:rPr>
-          <w:b/>
-          <w:color w:val="0F3460"/>
-        </w:rPr>
-        <w:t>Q2: Why not just write OpenGL or C directly?</w:t>
-      </w:r>
-    </w:p>
-    <w:p>
-      <w:pPr>
-        <w:spacing w:after="120"/>
-      </w:pPr>
-      <w:r>
-        <w:t>Answer: Direct OpenGL in C requires hundreds of lines of boilerplate: window setup, GLSL compilation, matrix math, pointers, and memory management. Our DSL achieves the same visual and interactive output in under 10 lines of declarative code, abstracting technical complexity away from users.</w:t>
-      </w:r>
-    </w:p>
-    <w:p>
-      <w:r>
-        <w:rPr>
-          <w:b/>
-          <w:color w:val="0F3460"/>
-        </w:rPr>
-        <w:t>Q3: How does your compiler ensure 60 FPS performance?</w:t>
-      </w:r>
-    </w:p>
-    <w:p>
-      <w:pPr>
-        <w:spacing w:after="120"/>
-      </w:pPr>
-      <w:r>
-        <w:t>Answer: For 2D shapes, the compiler emits code that compiles geometry into GPU Display Lists (glGenLists). Once compiled, the GPU re-executes the geometry in a single hardware call without CPU overhead. For shaders, calculation is performed entirely on GPU fragment units.</w:t>
-      </w:r>
-    </w:p>
-    <w:p>
-      <w:r>
-        <w:rPr>
-          <w:b/>
-          <w:color w:val="0F3460"/>
-        </w:rPr>
-        <w:t>Q4: What happens if a user writes invalid syntax?</w:t>
-      </w:r>
-    </w:p>
-    <w:p>
-      <w:pPr>
-        <w:spacing w:after="120"/>
-      </w:pPr>
-      <w:r>
-        <w:t>Answer: The lexer strips unrecognized tokens and the parser uses safe fallbacks (such as defaulting window size to 800x600 if omitted). If syntax is invalid, GCC reports descriptive compiler errors.</w:t>
-      </w:r>
-    </w:p>
     <w:sectPr>
       <w:pgSz w:w="12240" w:h="15840"/>
       <w:pgMar w:top="1440" w:right="1440" w:bottom="1440" w:left="1440" w:header="720" w:footer="720" w:gutter="0"/>
@@ -2677,11 +3048,6 @@
     <w:name w:val="Normal"/>
     <w:qFormat/>
     <w:rsid w:val="00FC693F"/>
-    <w:rPr>
-      <w:rFonts w:ascii="Calibri" w:hAnsi="Calibri"/>
-      <w:color w:val="222222"/>
-      <w:sz w:val="22"/>
-    </w:rPr>
   </w:style>
   <w:style w:type="paragraph" w:styleId="Header">
     <w:name w:val="header"/>

</xml_diff>